<commit_message>
Documentation, club delete member fix
</commit_message>
<xml_diff>
--- a/Documentation/Weekly Report/week7/CMSC-4920-Week7Report-Group2.docx
+++ b/Documentation/Weekly Report/week7/CMSC-4920-Week7Report-Group2.docx
@@ -1558,6 +1558,173 @@
     </w:p>
     <w:p>
       <w:pPr>
+        <w:spacing w:line="480" w:lineRule="auto"/>
+        <w:rPr>
+          <w:rFonts w:ascii="Times New Roman" w:hAnsi="Times New Roman" w:cs="Times New Roman"/>
+        </w:rPr>
+      </w:pPr>
+      <w:r>
+        <w:rPr>
+          <w:rFonts w:ascii="Times New Roman" w:hAnsi="Times New Roman" w:cs="Times New Roman"/>
+        </w:rPr>
+        <w:tab/>
+        <w:t>The first goal accom</w:t>
+      </w:r>
+      <w:r>
+        <w:rPr>
+          <w:rFonts w:ascii="Times New Roman" w:hAnsi="Times New Roman" w:cs="Times New Roman"/>
+        </w:rPr>
+        <w:t xml:space="preserve">plished was implementing a required login that prevented users from simply redirecting to the site by typing /dashboard. </w:t>
+      </w:r>
+      <w:r>
+        <w:rPr>
+          <w:rFonts w:ascii="Times New Roman" w:hAnsi="Times New Roman" w:cs="Times New Roman"/>
+        </w:rPr>
+        <w:t xml:space="preserve">Now, users </w:t>
+      </w:r>
+      <w:r>
+        <w:rPr>
+          <w:rFonts w:ascii="Times New Roman" w:hAnsi="Times New Roman" w:cs="Times New Roman"/>
+        </w:rPr>
+        <w:t>must</w:t>
+      </w:r>
+      <w:r>
+        <w:rPr>
+          <w:rFonts w:ascii="Times New Roman" w:hAnsi="Times New Roman" w:cs="Times New Roman"/>
+        </w:rPr>
+        <w:t xml:space="preserve"> log in using their credentials before they can access our dashboard, </w:t>
+      </w:r>
+      <w:r>
+        <w:rPr>
+          <w:rFonts w:ascii="Times New Roman" w:hAnsi="Times New Roman" w:cs="Times New Roman"/>
+        </w:rPr>
+        <w:t xml:space="preserve">activities, leaderboards, clubs, etc. </w:t>
+      </w:r>
+    </w:p>
+    <w:p>
+      <w:pPr>
+        <w:spacing w:line="480" w:lineRule="auto"/>
+        <w:rPr>
+          <w:rFonts w:ascii="Times New Roman" w:hAnsi="Times New Roman" w:cs="Times New Roman"/>
+        </w:rPr>
+      </w:pPr>
+      <w:r>
+        <w:rPr>
+          <w:rFonts w:ascii="Times New Roman" w:hAnsi="Times New Roman" w:cs="Times New Roman"/>
+        </w:rPr>
+        <w:tab/>
+        <w:t xml:space="preserve">The second goal accomplished was user testing. We had users </w:t>
+      </w:r>
+      <w:r>
+        <w:rPr>
+          <w:rFonts w:ascii="Times New Roman" w:hAnsi="Times New Roman" w:cs="Times New Roman"/>
+        </w:rPr>
+        <w:t xml:space="preserve">create accounts and run through each aspect of the </w:t>
+      </w:r>
+      <w:r>
+        <w:rPr>
+          <w:rFonts w:ascii="Times New Roman" w:hAnsi="Times New Roman" w:cs="Times New Roman"/>
+        </w:rPr>
+        <w:t xml:space="preserve">program. </w:t>
+      </w:r>
+      <w:r>
+        <w:rPr>
+          <w:rFonts w:ascii="Times New Roman" w:hAnsi="Times New Roman" w:cs="Times New Roman"/>
+        </w:rPr>
+        <w:t xml:space="preserve">Feedback was placed into the user feedback document. Users brought up changes we know we </w:t>
+      </w:r>
+      <w:proofErr w:type="gramStart"/>
+      <w:r>
+        <w:rPr>
+          <w:rFonts w:ascii="Times New Roman" w:hAnsi="Times New Roman" w:cs="Times New Roman"/>
+        </w:rPr>
+        <w:t>have to</w:t>
+      </w:r>
+      <w:proofErr w:type="gramEnd"/>
+      <w:r>
+        <w:rPr>
+          <w:rFonts w:ascii="Times New Roman" w:hAnsi="Times New Roman" w:cs="Times New Roman"/>
+        </w:rPr>
+        <w:t xml:space="preserve"> make and changes that we had no idea needed fixing. One of the main ones was to </w:t>
+      </w:r>
+      <w:r>
+        <w:rPr>
+          <w:rFonts w:ascii="Times New Roman" w:hAnsi="Times New Roman" w:cs="Times New Roman"/>
+        </w:rPr>
+        <w:t xml:space="preserve">verify logins and create accounts better. For example, if a user has no credentials in our database but tries to log in, we should alert them, telling them that no such credentials exist. </w:t>
+      </w:r>
+    </w:p>
+    <w:p>
+      <w:pPr>
+        <w:spacing w:line="480" w:lineRule="auto"/>
+        <w:rPr>
+          <w:rFonts w:ascii="Times New Roman" w:hAnsi="Times New Roman" w:cs="Times New Roman"/>
+        </w:rPr>
+      </w:pPr>
+      <w:r>
+        <w:rPr>
+          <w:rFonts w:ascii="Times New Roman" w:hAnsi="Times New Roman" w:cs="Times New Roman"/>
+        </w:rPr>
+        <w:tab/>
+        <w:t>The third goal accomplished was finding an application for recovery emails. Through various research</w:t>
+      </w:r>
+      <w:r>
+        <w:rPr>
+          <w:rFonts w:ascii="Times New Roman" w:hAnsi="Times New Roman" w:cs="Times New Roman"/>
+        </w:rPr>
+        <w:t>,</w:t>
+      </w:r>
+      <w:r>
+        <w:rPr>
+          <w:rFonts w:ascii="Times New Roman" w:hAnsi="Times New Roman" w:cs="Times New Roman"/>
+        </w:rPr>
+        <w:t xml:space="preserve"> we found the application Resend. </w:t>
+      </w:r>
+      <w:r>
+        <w:rPr>
+          <w:rFonts w:ascii="Times New Roman" w:hAnsi="Times New Roman" w:cs="Times New Roman"/>
+        </w:rPr>
+        <w:t>We felt that Resend</w:t>
+      </w:r>
+      <w:r>
+        <w:rPr>
+          <w:rFonts w:ascii="Times New Roman" w:hAnsi="Times New Roman" w:cs="Times New Roman"/>
+        </w:rPr>
+        <w:t xml:space="preserve"> was best</w:t>
+      </w:r>
+      <w:r>
+        <w:rPr>
+          <w:rFonts w:ascii="Times New Roman" w:hAnsi="Times New Roman" w:cs="Times New Roman"/>
+        </w:rPr>
+        <w:t>,</w:t>
+      </w:r>
+      <w:r>
+        <w:rPr>
+          <w:rFonts w:ascii="Times New Roman" w:hAnsi="Times New Roman" w:cs="Times New Roman"/>
+        </w:rPr>
+        <w:t xml:space="preserve"> as with the free tier of the software</w:t>
+      </w:r>
+      <w:r>
+        <w:rPr>
+          <w:rFonts w:ascii="Times New Roman" w:hAnsi="Times New Roman" w:cs="Times New Roman"/>
+        </w:rPr>
+        <w:t>,</w:t>
+      </w:r>
+      <w:r>
+        <w:rPr>
+          <w:rFonts w:ascii="Times New Roman" w:hAnsi="Times New Roman" w:cs="Times New Roman"/>
+        </w:rPr>
+        <w:t xml:space="preserve"> we get a daily limit of 100 emails and a monthly limit of </w:t>
+      </w:r>
+      <w:r>
+        <w:rPr>
+          <w:rFonts w:ascii="Times New Roman" w:hAnsi="Times New Roman" w:cs="Times New Roman"/>
+        </w:rPr>
+        <w:t xml:space="preserve">3,000 emails. We created an account </w:t>
+      </w:r>
+    </w:p>
+    <w:p>
+      <w:pPr>
         <w:pStyle w:val="Heading2"/>
         <w:rPr>
           <w:rFonts w:ascii="Times New Roman" w:hAnsi="Times New Roman" w:cs="Times New Roman"/>
@@ -1619,6 +1786,118 @@
           <w:iCs/>
         </w:rPr>
         <w:t>(Number aligns with its solution below)</w:t>
+      </w:r>
+    </w:p>
+    <w:p>
+      <w:pPr>
+        <w:pStyle w:val="ListParagraph"/>
+        <w:numPr>
+          <w:ilvl w:val="0"/>
+          <w:numId w:val="10"/>
+        </w:numPr>
+        <w:spacing w:line="480" w:lineRule="auto"/>
+        <w:rPr>
+          <w:rFonts w:ascii="Times New Roman" w:hAnsi="Times New Roman" w:cs="Times New Roman"/>
+        </w:rPr>
+      </w:pPr>
+      <w:r>
+        <w:rPr>
+          <w:rFonts w:ascii="Times New Roman" w:hAnsi="Times New Roman" w:cs="Times New Roman"/>
+        </w:rPr>
+        <w:t xml:space="preserve">Rerouting difficult to fix since pages </w:t>
+      </w:r>
+      <w:r>
+        <w:rPr>
+          <w:rFonts w:ascii="Times New Roman" w:hAnsi="Times New Roman" w:cs="Times New Roman"/>
+        </w:rPr>
+        <w:t xml:space="preserve">are </w:t>
+      </w:r>
+      <w:r>
+        <w:rPr>
+          <w:rFonts w:ascii="Times New Roman" w:hAnsi="Times New Roman" w:cs="Times New Roman"/>
+        </w:rPr>
+        <w:t>dynamically loaded</w:t>
+      </w:r>
+    </w:p>
+    <w:p>
+      <w:pPr>
+        <w:pStyle w:val="ListParagraph"/>
+        <w:numPr>
+          <w:ilvl w:val="0"/>
+          <w:numId w:val="10"/>
+        </w:numPr>
+        <w:spacing w:line="480" w:lineRule="auto"/>
+        <w:rPr>
+          <w:rFonts w:ascii="Times New Roman" w:hAnsi="Times New Roman" w:cs="Times New Roman"/>
+        </w:rPr>
+      </w:pPr>
+      <w:r>
+        <w:rPr>
+          <w:rFonts w:ascii="Times New Roman" w:hAnsi="Times New Roman" w:cs="Times New Roman"/>
+        </w:rPr>
+        <w:t xml:space="preserve">Use of local host </w:t>
+      </w:r>
+      <w:r>
+        <w:rPr>
+          <w:rFonts w:ascii="Times New Roman" w:hAnsi="Times New Roman" w:cs="Times New Roman"/>
+        </w:rPr>
+        <w:t xml:space="preserve">is </w:t>
+      </w:r>
+      <w:r>
+        <w:rPr>
+          <w:rFonts w:ascii="Times New Roman" w:hAnsi="Times New Roman" w:cs="Times New Roman"/>
+        </w:rPr>
+        <w:t>insecure</w:t>
+      </w:r>
+    </w:p>
+    <w:p>
+      <w:pPr>
+        <w:pStyle w:val="ListParagraph"/>
+        <w:numPr>
+          <w:ilvl w:val="0"/>
+          <w:numId w:val="10"/>
+        </w:numPr>
+        <w:spacing w:line="480" w:lineRule="auto"/>
+        <w:rPr>
+          <w:rFonts w:ascii="Times New Roman" w:hAnsi="Times New Roman" w:cs="Times New Roman"/>
+        </w:rPr>
+      </w:pPr>
+      <w:r>
+        <w:rPr>
+          <w:rFonts w:ascii="Times New Roman" w:hAnsi="Times New Roman" w:cs="Times New Roman"/>
+        </w:rPr>
+        <w:t>Email Password Recovery Backend</w:t>
+      </w:r>
+      <w:r>
+        <w:rPr>
+          <w:rFonts w:ascii="Times New Roman" w:hAnsi="Times New Roman" w:cs="Times New Roman"/>
+        </w:rPr>
+        <w:t xml:space="preserve"> – While we successfully found a </w:t>
+      </w:r>
+      <w:r>
+        <w:rPr>
+          <w:rFonts w:ascii="Times New Roman" w:hAnsi="Times New Roman" w:cs="Times New Roman"/>
+        </w:rPr>
+        <w:t>site for email sending in Resend</w:t>
+      </w:r>
+      <w:r>
+        <w:rPr>
+          <w:rFonts w:ascii="Times New Roman" w:hAnsi="Times New Roman" w:cs="Times New Roman"/>
+        </w:rPr>
+        <w:t xml:space="preserve"> and implemented a frontend page to request an email to reset a </w:t>
+      </w:r>
+      <w:r>
+        <w:rPr>
+          <w:rFonts w:ascii="Times New Roman" w:hAnsi="Times New Roman" w:cs="Times New Roman"/>
+        </w:rPr>
+        <w:lastRenderedPageBreak/>
+        <w:t>password, we are still having a server error on the backend</w:t>
+      </w:r>
+      <w:r>
+        <w:rPr>
+          <w:rFonts w:ascii="Times New Roman" w:hAnsi="Times New Roman" w:cs="Times New Roman"/>
+        </w:rPr>
+        <w:t xml:space="preserve">. Through lots of debugging we still haven’t quite nailed down the issue yet, but this will be one of the main goals for this upcoming week. </w:t>
       </w:r>
     </w:p>
     <w:p>
@@ -1823,6 +2102,81 @@
         <w:t>Plan:</w:t>
       </w:r>
       <w:bookmarkEnd w:id="6"/>
+    </w:p>
+    <w:p>
+      <w:pPr>
+        <w:spacing w:line="480" w:lineRule="auto"/>
+        <w:rPr>
+          <w:rFonts w:ascii="Times New Roman" w:hAnsi="Times New Roman" w:cs="Times New Roman"/>
+        </w:rPr>
+      </w:pPr>
+      <w:r>
+        <w:tab/>
+      </w:r>
+      <w:r>
+        <w:rPr>
+          <w:rFonts w:ascii="Times New Roman" w:hAnsi="Times New Roman" w:cs="Times New Roman"/>
+        </w:rPr>
+        <w:t xml:space="preserve">Our week 8 plan is going to focus on </w:t>
+      </w:r>
+      <w:r>
+        <w:rPr>
+          <w:rFonts w:ascii="Times New Roman" w:hAnsi="Times New Roman" w:cs="Times New Roman"/>
+        </w:rPr>
+        <w:t xml:space="preserve">getting these recovery emails up and working. We also want to consider our user feedback and begin making those changes, with some of them already being completed. </w:t>
+      </w:r>
+      <w:r>
+        <w:rPr>
+          <w:rFonts w:ascii="Times New Roman" w:hAnsi="Times New Roman" w:cs="Times New Roman"/>
+        </w:rPr>
+        <w:t xml:space="preserve">One of those features is the User Profile Section, which would also allow us a chance to implement a delete account feature that was also requested by the user. </w:t>
+      </w:r>
+      <w:r>
+        <w:rPr>
+          <w:rFonts w:ascii="Times New Roman" w:hAnsi="Times New Roman" w:cs="Times New Roman"/>
+        </w:rPr>
+        <w:t>We also want to continue to improve the pages that are developed</w:t>
+      </w:r>
+      <w:r>
+        <w:rPr>
+          <w:rFonts w:ascii="Times New Roman" w:hAnsi="Times New Roman" w:cs="Times New Roman"/>
+        </w:rPr>
+        <w:t xml:space="preserve">, with some of them still having minor bugs in them. </w:t>
+      </w:r>
+      <w:r>
+        <w:rPr>
+          <w:rFonts w:ascii="Times New Roman" w:hAnsi="Times New Roman" w:cs="Times New Roman"/>
+        </w:rPr>
+        <w:t xml:space="preserve">We also want to continue to develop our maps page, as we began </w:t>
+      </w:r>
+      <w:proofErr w:type="gramStart"/>
+      <w:r>
+        <w:rPr>
+          <w:rFonts w:ascii="Times New Roman" w:hAnsi="Times New Roman" w:cs="Times New Roman"/>
+        </w:rPr>
+        <w:t>work</w:t>
+      </w:r>
+      <w:proofErr w:type="gramEnd"/>
+      <w:r>
+        <w:rPr>
+          <w:rFonts w:ascii="Times New Roman" w:hAnsi="Times New Roman" w:cs="Times New Roman"/>
+        </w:rPr>
+        <w:t xml:space="preserve"> on this page </w:t>
+      </w:r>
+      <w:proofErr w:type="gramStart"/>
+      <w:r>
+        <w:rPr>
+          <w:rFonts w:ascii="Times New Roman" w:hAnsi="Times New Roman" w:cs="Times New Roman"/>
+        </w:rPr>
+        <w:t>later on</w:t>
+      </w:r>
+      <w:proofErr w:type="gramEnd"/>
+      <w:r>
+        <w:rPr>
+          <w:rFonts w:ascii="Times New Roman" w:hAnsi="Times New Roman" w:cs="Times New Roman"/>
+        </w:rPr>
+        <w:t xml:space="preserve"> in week 7. </w:t>
+      </w:r>
     </w:p>
     <w:p>
       <w:pPr>
@@ -2676,6 +3030,95 @@
     </w:lvl>
   </w:abstractNum>
   <w:abstractNum w:abstractNumId="3" w15:restartNumberingAfterBreak="0">
+    <w:nsid w:val="4217313A"/>
+    <w:multiLevelType w:val="hybridMultilevel"/>
+    <w:tmpl w:val="32322624"/>
+    <w:lvl w:ilvl="0" w:tplc="0409000F">
+      <w:start w:val="1"/>
+      <w:numFmt w:val="decimal"/>
+      <w:lvlText w:val="%1."/>
+      <w:lvlJc w:val="left"/>
+      <w:pPr>
+        <w:ind w:left="720" w:hanging="360"/>
+      </w:pPr>
+      <w:rPr>
+        <w:rFonts w:hint="default"/>
+      </w:rPr>
+    </w:lvl>
+    <w:lvl w:ilvl="1" w:tplc="04090019" w:tentative="1">
+      <w:start w:val="1"/>
+      <w:numFmt w:val="lowerLetter"/>
+      <w:lvlText w:val="%2."/>
+      <w:lvlJc w:val="left"/>
+      <w:pPr>
+        <w:ind w:left="1440" w:hanging="360"/>
+      </w:pPr>
+    </w:lvl>
+    <w:lvl w:ilvl="2" w:tplc="0409001B" w:tentative="1">
+      <w:start w:val="1"/>
+      <w:numFmt w:val="lowerRoman"/>
+      <w:lvlText w:val="%3."/>
+      <w:lvlJc w:val="right"/>
+      <w:pPr>
+        <w:ind w:left="2160" w:hanging="180"/>
+      </w:pPr>
+    </w:lvl>
+    <w:lvl w:ilvl="3" w:tplc="0409000F" w:tentative="1">
+      <w:start w:val="1"/>
+      <w:numFmt w:val="decimal"/>
+      <w:lvlText w:val="%4."/>
+      <w:lvlJc w:val="left"/>
+      <w:pPr>
+        <w:ind w:left="2880" w:hanging="360"/>
+      </w:pPr>
+    </w:lvl>
+    <w:lvl w:ilvl="4" w:tplc="04090019" w:tentative="1">
+      <w:start w:val="1"/>
+      <w:numFmt w:val="lowerLetter"/>
+      <w:lvlText w:val="%5."/>
+      <w:lvlJc w:val="left"/>
+      <w:pPr>
+        <w:ind w:left="3600" w:hanging="360"/>
+      </w:pPr>
+    </w:lvl>
+    <w:lvl w:ilvl="5" w:tplc="0409001B" w:tentative="1">
+      <w:start w:val="1"/>
+      <w:numFmt w:val="lowerRoman"/>
+      <w:lvlText w:val="%6."/>
+      <w:lvlJc w:val="right"/>
+      <w:pPr>
+        <w:ind w:left="4320" w:hanging="180"/>
+      </w:pPr>
+    </w:lvl>
+    <w:lvl w:ilvl="6" w:tplc="0409000F" w:tentative="1">
+      <w:start w:val="1"/>
+      <w:numFmt w:val="decimal"/>
+      <w:lvlText w:val="%7."/>
+      <w:lvlJc w:val="left"/>
+      <w:pPr>
+        <w:ind w:left="5040" w:hanging="360"/>
+      </w:pPr>
+    </w:lvl>
+    <w:lvl w:ilvl="7" w:tplc="04090019" w:tentative="1">
+      <w:start w:val="1"/>
+      <w:numFmt w:val="lowerLetter"/>
+      <w:lvlText w:val="%8."/>
+      <w:lvlJc w:val="left"/>
+      <w:pPr>
+        <w:ind w:left="5760" w:hanging="360"/>
+      </w:pPr>
+    </w:lvl>
+    <w:lvl w:ilvl="8" w:tplc="0409001B" w:tentative="1">
+      <w:start w:val="1"/>
+      <w:numFmt w:val="lowerRoman"/>
+      <w:lvlText w:val="%9."/>
+      <w:lvlJc w:val="right"/>
+      <w:pPr>
+        <w:ind w:left="6480" w:hanging="180"/>
+      </w:pPr>
+    </w:lvl>
+  </w:abstractNum>
+  <w:abstractNum w:abstractNumId="4" w15:restartNumberingAfterBreak="0">
     <w:nsid w:val="47F307AE"/>
     <w:multiLevelType w:val="hybridMultilevel"/>
     <w:tmpl w:val="27B244C2"/>
@@ -2764,7 +3207,7 @@
       </w:pPr>
     </w:lvl>
   </w:abstractNum>
-  <w:abstractNum w:abstractNumId="4" w15:restartNumberingAfterBreak="0">
+  <w:abstractNum w:abstractNumId="5" w15:restartNumberingAfterBreak="0">
     <w:nsid w:val="52611675"/>
     <w:multiLevelType w:val="hybridMultilevel"/>
     <w:tmpl w:val="EDD4A492"/>
@@ -2850,7 +3293,7 @@
       </w:pPr>
     </w:lvl>
   </w:abstractNum>
-  <w:abstractNum w:abstractNumId="5" w15:restartNumberingAfterBreak="0">
+  <w:abstractNum w:abstractNumId="6" w15:restartNumberingAfterBreak="0">
     <w:nsid w:val="61BB11DC"/>
     <w:multiLevelType w:val="hybridMultilevel"/>
     <w:tmpl w:val="7C10039A"/>
@@ -2940,7 +3383,7 @@
       </w:pPr>
     </w:lvl>
   </w:abstractNum>
-  <w:abstractNum w:abstractNumId="6" w15:restartNumberingAfterBreak="0">
+  <w:abstractNum w:abstractNumId="7" w15:restartNumberingAfterBreak="0">
     <w:nsid w:val="70442270"/>
     <w:multiLevelType w:val="hybridMultilevel"/>
     <w:tmpl w:val="C14E5556"/>
@@ -3029,7 +3472,7 @@
       </w:pPr>
     </w:lvl>
   </w:abstractNum>
-  <w:abstractNum w:abstractNumId="7" w15:restartNumberingAfterBreak="0">
+  <w:abstractNum w:abstractNumId="8" w15:restartNumberingAfterBreak="0">
     <w:nsid w:val="75272BE1"/>
     <w:multiLevelType w:val="hybridMultilevel"/>
     <w:tmpl w:val="09F8AA0C"/>
@@ -3118,7 +3561,7 @@
       </w:pPr>
     </w:lvl>
   </w:abstractNum>
-  <w:abstractNum w:abstractNumId="8" w15:restartNumberingAfterBreak="0">
+  <w:abstractNum w:abstractNumId="9" w15:restartNumberingAfterBreak="0">
     <w:nsid w:val="76AC7E6C"/>
     <w:multiLevelType w:val="hybridMultilevel"/>
     <w:tmpl w:val="A40AA83A"/>
@@ -3235,28 +3678,31 @@
     <w:abstractNumId w:val="1"/>
   </w:num>
   <w:num w:numId="2" w16cid:durableId="1339843216">
-    <w:abstractNumId w:val="8"/>
+    <w:abstractNumId w:val="9"/>
   </w:num>
   <w:num w:numId="3" w16cid:durableId="89549674">
     <w:abstractNumId w:val="0"/>
   </w:num>
   <w:num w:numId="4" w16cid:durableId="2010134716">
+    <w:abstractNumId w:val="5"/>
+  </w:num>
+  <w:num w:numId="5" w16cid:durableId="31227179">
+    <w:abstractNumId w:val="6"/>
+  </w:num>
+  <w:num w:numId="6" w16cid:durableId="1534685845">
+    <w:abstractNumId w:val="8"/>
+  </w:num>
+  <w:num w:numId="7" w16cid:durableId="1046374056">
     <w:abstractNumId w:val="4"/>
   </w:num>
-  <w:num w:numId="5" w16cid:durableId="31227179">
-    <w:abstractNumId w:val="5"/>
-  </w:num>
-  <w:num w:numId="6" w16cid:durableId="1534685845">
+  <w:num w:numId="8" w16cid:durableId="1260724421">
     <w:abstractNumId w:val="7"/>
-  </w:num>
-  <w:num w:numId="7" w16cid:durableId="1046374056">
-    <w:abstractNumId w:val="3"/>
-  </w:num>
-  <w:num w:numId="8" w16cid:durableId="1260724421">
-    <w:abstractNumId w:val="6"/>
   </w:num>
   <w:num w:numId="9" w16cid:durableId="1954969753">
     <w:abstractNumId w:val="2"/>
+  </w:num>
+  <w:num w:numId="10" w16cid:durableId="199709251">
+    <w:abstractNumId w:val="3"/>
   </w:num>
 </w:numbering>
 </file>

</xml_diff>

<commit_message>
slides, will video upload hmm
</commit_message>
<xml_diff>
--- a/Documentation/Weekly Report/week7/CMSC-4920-Week7Report-Group2.docx
+++ b/Documentation/Weekly Report/week7/CMSC-4920-Week7Report-Group2.docx
@@ -1558,19 +1558,21 @@
         <w:rPr>
           <w:rFonts w:ascii="Times New Roman" w:hAnsi="Times New Roman" w:cs="Times New Roman"/>
         </w:rPr>
-        <w:t>implementing a feature that ensures a user is logged in before they can access the dashboard</w:t>
-      </w:r>
-      <w:r>
-        <w:rPr>
-          <w:rFonts w:ascii="Times New Roman" w:hAnsi="Times New Roman" w:cs="Times New Roman"/>
-        </w:rPr>
-        <w:t xml:space="preserve">, </w:t>
-      </w:r>
-      <w:r>
-        <w:rPr>
-          <w:rFonts w:ascii="Times New Roman" w:hAnsi="Times New Roman" w:cs="Times New Roman"/>
-        </w:rPr>
-        <w:t>opening up our program</w:t>
+        <w:t xml:space="preserve">implementing a feature that ensures a user is logged in before they can access the dashboard, </w:t>
+      </w:r>
+      <w:proofErr w:type="gramStart"/>
+      <w:r>
+        <w:rPr>
+          <w:rFonts w:ascii="Times New Roman" w:hAnsi="Times New Roman" w:cs="Times New Roman"/>
+        </w:rPr>
+        <w:t>opening up</w:t>
+      </w:r>
+      <w:proofErr w:type="gramEnd"/>
+      <w:r>
+        <w:rPr>
+          <w:rFonts w:ascii="Times New Roman" w:hAnsi="Times New Roman" w:cs="Times New Roman"/>
+        </w:rPr>
+        <w:t xml:space="preserve"> our program</w:t>
       </w:r>
       <w:r>
         <w:rPr>
@@ -1594,7 +1596,27 @@
         <w:rPr>
           <w:rFonts w:ascii="Times New Roman" w:hAnsi="Times New Roman" w:cs="Times New Roman"/>
         </w:rPr>
-        <w:t xml:space="preserve"> beta testing</w:t>
+        <w:t xml:space="preserve"> beta testing,</w:t>
+      </w:r>
+      <w:r>
+        <w:rPr>
+          <w:rFonts w:ascii="Times New Roman" w:hAnsi="Times New Roman" w:cs="Times New Roman"/>
+        </w:rPr>
+        <w:t xml:space="preserve"> </w:t>
+      </w:r>
+      <w:proofErr w:type="gramStart"/>
+      <w:r>
+        <w:rPr>
+          <w:rFonts w:ascii="Times New Roman" w:hAnsi="Times New Roman" w:cs="Times New Roman"/>
+        </w:rPr>
+        <w:t>work</w:t>
+      </w:r>
+      <w:proofErr w:type="gramEnd"/>
+      <w:r>
+        <w:rPr>
+          <w:rFonts w:ascii="Times New Roman" w:hAnsi="Times New Roman" w:cs="Times New Roman"/>
+        </w:rPr>
+        <w:t xml:space="preserve"> on a recovery email feature</w:t>
       </w:r>
       <w:r>
         <w:rPr>
@@ -1606,18 +1628,6 @@
         <w:rPr>
           <w:rFonts w:ascii="Times New Roman" w:hAnsi="Times New Roman" w:cs="Times New Roman"/>
         </w:rPr>
-        <w:t xml:space="preserve"> work on a recovery email feature</w:t>
-      </w:r>
-      <w:r>
-        <w:rPr>
-          <w:rFonts w:ascii="Times New Roman" w:hAnsi="Times New Roman" w:cs="Times New Roman"/>
-        </w:rPr>
-        <w:t>,</w:t>
-      </w:r>
-      <w:r>
-        <w:rPr>
-          <w:rFonts w:ascii="Times New Roman" w:hAnsi="Times New Roman" w:cs="Times New Roman"/>
-        </w:rPr>
         <w:t xml:space="preserve"> and </w:t>
       </w:r>
       <w:r>
@@ -1630,7 +1640,21 @@
         <w:rPr>
           <w:rFonts w:ascii="Times New Roman" w:hAnsi="Times New Roman" w:cs="Times New Roman"/>
         </w:rPr>
-        <w:t xml:space="preserve"> development of both the challenges and teams page</w:t>
+        <w:t xml:space="preserve"> development of both the challenges and </w:t>
+      </w:r>
+      <w:proofErr w:type="gramStart"/>
+      <w:r>
+        <w:rPr>
+          <w:rFonts w:ascii="Times New Roman" w:hAnsi="Times New Roman" w:cs="Times New Roman"/>
+        </w:rPr>
+        <w:t>teams</w:t>
+      </w:r>
+      <w:proofErr w:type="gramEnd"/>
+      <w:r>
+        <w:rPr>
+          <w:rFonts w:ascii="Times New Roman" w:hAnsi="Times New Roman" w:cs="Times New Roman"/>
+        </w:rPr>
+        <w:t xml:space="preserve"> page</w:t>
       </w:r>
       <w:r>
         <w:rPr>
@@ -1672,7 +1696,35 @@
         <w:rPr>
           <w:rFonts w:ascii="Times New Roman" w:hAnsi="Times New Roman" w:cs="Times New Roman"/>
         </w:rPr>
-        <w:t>not allowing access to the tracker before a user is properly logged in, was the main goal of this week. Achieving this goal will help upkeep the privacy of our tracker.</w:t>
+        <w:t xml:space="preserve">not allowing access to the tracker before a user is properly logged </w:t>
+      </w:r>
+      <w:proofErr w:type="gramStart"/>
+      <w:r>
+        <w:rPr>
+          <w:rFonts w:ascii="Times New Roman" w:hAnsi="Times New Roman" w:cs="Times New Roman"/>
+        </w:rPr>
+        <w:t>in,</w:t>
+      </w:r>
+      <w:proofErr w:type="gramEnd"/>
+      <w:r>
+        <w:rPr>
+          <w:rFonts w:ascii="Times New Roman" w:hAnsi="Times New Roman" w:cs="Times New Roman"/>
+        </w:rPr>
+        <w:t xml:space="preserve"> was the main goal of this week. Achieving this goal will help </w:t>
+      </w:r>
+      <w:proofErr w:type="gramStart"/>
+      <w:r>
+        <w:rPr>
+          <w:rFonts w:ascii="Times New Roman" w:hAnsi="Times New Roman" w:cs="Times New Roman"/>
+        </w:rPr>
+        <w:t>upkeep</w:t>
+      </w:r>
+      <w:proofErr w:type="gramEnd"/>
+      <w:r>
+        <w:rPr>
+          <w:rFonts w:ascii="Times New Roman" w:hAnsi="Times New Roman" w:cs="Times New Roman"/>
+        </w:rPr>
+        <w:t xml:space="preserve"> the privacy of our tracker.</w:t>
       </w:r>
     </w:p>
     <w:p>
@@ -1776,7 +1828,21 @@
         <w:rPr>
           <w:rFonts w:ascii="Times New Roman" w:hAnsi="Times New Roman" w:cs="Times New Roman"/>
         </w:rPr>
-        <w:t xml:space="preserve">Feedback was placed into the user feedback document. Users brought up changes we know we have to make and changes that we had no idea needed fixing. One of the main ones was to </w:t>
+        <w:t xml:space="preserve">Feedback was placed into the user feedback document. Users brought up changes we know we </w:t>
+      </w:r>
+      <w:proofErr w:type="gramStart"/>
+      <w:r>
+        <w:rPr>
+          <w:rFonts w:ascii="Times New Roman" w:hAnsi="Times New Roman" w:cs="Times New Roman"/>
+        </w:rPr>
+        <w:t>have to</w:t>
+      </w:r>
+      <w:proofErr w:type="gramEnd"/>
+      <w:r>
+        <w:rPr>
+          <w:rFonts w:ascii="Times New Roman" w:hAnsi="Times New Roman" w:cs="Times New Roman"/>
+        </w:rPr>
+        <w:t xml:space="preserve"> make and changes that we had no idea needed fixing. One of the main ones was to </w:t>
       </w:r>
       <w:r>
         <w:rPr>
@@ -1802,6 +1868,7 @@
     <w:p>
       <w:pPr>
         <w:spacing w:line="480" w:lineRule="auto"/>
+        <w:ind w:firstLine="720"/>
         <w:rPr>
           <w:rFonts w:ascii="Times New Roman" w:hAnsi="Times New Roman" w:cs="Times New Roman"/>
         </w:rPr>
@@ -1811,7 +1878,19 @@
           <w:rFonts w:ascii="Times New Roman" w:hAnsi="Times New Roman" w:cs="Times New Roman"/>
         </w:rPr>
         <w:lastRenderedPageBreak/>
-        <w:t>The third goal accomplished was finding an application for recovery emails. Through various research</w:t>
+        <w:t xml:space="preserve">The third goal </w:t>
+      </w:r>
+      <w:r>
+        <w:rPr>
+          <w:rFonts w:ascii="Times New Roman" w:hAnsi="Times New Roman" w:cs="Times New Roman"/>
+        </w:rPr>
+        <w:t xml:space="preserve">that was </w:t>
+      </w:r>
+      <w:r>
+        <w:rPr>
+          <w:rFonts w:ascii="Times New Roman" w:hAnsi="Times New Roman" w:cs="Times New Roman"/>
+        </w:rPr>
+        <w:t>accomplished was finding an application for recovery emails. Through various research</w:t>
       </w:r>
       <w:r>
         <w:rPr>
@@ -1880,7 +1959,21 @@
           <w:rFonts w:ascii="Times New Roman" w:hAnsi="Times New Roman" w:cs="Times New Roman"/>
         </w:rPr>
         <w:tab/>
-        <w:t>The fourth goal accomplished this week was the further development of the challenges page. A user can now join and leave challenges, a user can also delete a challenge if they are the creator of the challenge. Users can now also view individual challenge details page that will display the challenges description, participant count, and more.</w:t>
+        <w:t xml:space="preserve">The fourth goal accomplished this week was the further development of the challenges page. A user can now join and leave </w:t>
+      </w:r>
+      <w:proofErr w:type="gramStart"/>
+      <w:r>
+        <w:rPr>
+          <w:rFonts w:ascii="Times New Roman" w:hAnsi="Times New Roman" w:cs="Times New Roman"/>
+        </w:rPr>
+        <w:t>challenges,</w:t>
+      </w:r>
+      <w:proofErr w:type="gramEnd"/>
+      <w:r>
+        <w:rPr>
+          <w:rFonts w:ascii="Times New Roman" w:hAnsi="Times New Roman" w:cs="Times New Roman"/>
+        </w:rPr>
+        <w:t xml:space="preserve"> a user can also delete a challenge if they are the creator of the challenge. Users can now also view individual challenge details page that will display the challenges description, participant count, and more.</w:t>
       </w:r>
     </w:p>
     <w:p>
@@ -2050,7 +2143,21 @@
         <w:rPr>
           <w:rFonts w:ascii="Times New Roman" w:hAnsi="Times New Roman" w:cs="Times New Roman"/>
         </w:rPr>
-        <w:t xml:space="preserve">. Through lots of debugging we still haven’t quite nailed down the issue yet, but this will be one of the main goals for this upcoming week. </w:t>
+        <w:t xml:space="preserve">. Through lots of </w:t>
+      </w:r>
+      <w:proofErr w:type="gramStart"/>
+      <w:r>
+        <w:rPr>
+          <w:rFonts w:ascii="Times New Roman" w:hAnsi="Times New Roman" w:cs="Times New Roman"/>
+        </w:rPr>
+        <w:t>debugging</w:t>
+      </w:r>
+      <w:proofErr w:type="gramEnd"/>
+      <w:r>
+        <w:rPr>
+          <w:rFonts w:ascii="Times New Roman" w:hAnsi="Times New Roman" w:cs="Times New Roman"/>
+        </w:rPr>
+        <w:t xml:space="preserve"> we still haven’t quite nailed down the issue yet, but this will be one of the main goals for this upcoming week. </w:t>
       </w:r>
     </w:p>
     <w:p>
@@ -2245,7 +2352,21 @@
         <w:rPr>
           <w:rFonts w:ascii="Times New Roman" w:hAnsi="Times New Roman" w:cs="Times New Roman"/>
         </w:rPr>
-        <w:t>Another major step forward was conducting user testing. We had multiple users create accounts, and go through the activity trackers various feature</w:t>
+        <w:t xml:space="preserve">Another major step forward was conducting user testing. We had multiple users create </w:t>
+      </w:r>
+      <w:proofErr w:type="gramStart"/>
+      <w:r>
+        <w:rPr>
+          <w:rFonts w:ascii="Times New Roman" w:hAnsi="Times New Roman" w:cs="Times New Roman"/>
+        </w:rPr>
+        <w:t>accounts, and</w:t>
+      </w:r>
+      <w:proofErr w:type="gramEnd"/>
+      <w:r>
+        <w:rPr>
+          <w:rFonts w:ascii="Times New Roman" w:hAnsi="Times New Roman" w:cs="Times New Roman"/>
+        </w:rPr>
+        <w:t xml:space="preserve"> go through the activity trackers various feature</w:t>
       </w:r>
       <w:r>
         <w:rPr>
@@ -2282,7 +2403,47 @@
           <w:rFonts w:ascii="Times New Roman" w:hAnsi="Times New Roman" w:cs="Times New Roman"/>
         </w:rPr>
         <w:lastRenderedPageBreak/>
-        <w:t xml:space="preserve">The last accomplishment of this week was the continued development of both our challenges and teams pages. The development of both is moving at a slow but steady pace as we are trying to link the activity data and the frontend to present user with a good looking UI that gives them their data in ways that improve clarity and </w:t>
+        <w:t xml:space="preserve">The last accomplishment of this week was the continued development of both our challenges and </w:t>
+      </w:r>
+      <w:proofErr w:type="gramStart"/>
+      <w:r>
+        <w:rPr>
+          <w:rFonts w:ascii="Times New Roman" w:hAnsi="Times New Roman" w:cs="Times New Roman"/>
+        </w:rPr>
+        <w:t>teams</w:t>
+      </w:r>
+      <w:proofErr w:type="gramEnd"/>
+      <w:r>
+        <w:rPr>
+          <w:rFonts w:ascii="Times New Roman" w:hAnsi="Times New Roman" w:cs="Times New Roman"/>
+        </w:rPr>
+        <w:t xml:space="preserve"> pages. The development of both is moving at a slow but steady pace as we are trying to link the activity data and the frontend to present </w:t>
+      </w:r>
+      <w:proofErr w:type="gramStart"/>
+      <w:r>
+        <w:rPr>
+          <w:rFonts w:ascii="Times New Roman" w:hAnsi="Times New Roman" w:cs="Times New Roman"/>
+        </w:rPr>
+        <w:t>user</w:t>
+      </w:r>
+      <w:proofErr w:type="gramEnd"/>
+      <w:r>
+        <w:rPr>
+          <w:rFonts w:ascii="Times New Roman" w:hAnsi="Times New Roman" w:cs="Times New Roman"/>
+        </w:rPr>
+        <w:t xml:space="preserve"> with a </w:t>
+      </w:r>
+      <w:r>
+        <w:rPr>
+          <w:rFonts w:ascii="Times New Roman" w:hAnsi="Times New Roman" w:cs="Times New Roman"/>
+        </w:rPr>
+        <w:t xml:space="preserve">dynamic </w:t>
+      </w:r>
+      <w:r>
+        <w:rPr>
+          <w:rFonts w:ascii="Times New Roman" w:hAnsi="Times New Roman" w:cs="Times New Roman"/>
+        </w:rPr>
+        <w:t xml:space="preserve">UI that gives them their data in ways that improve clarity and </w:t>
       </w:r>
       <w:r>
         <w:rPr>
@@ -2506,13 +2667,35 @@
         <w:rPr>
           <w:rFonts w:ascii="Times New Roman" w:hAnsi="Times New Roman" w:cs="Times New Roman"/>
         </w:rPr>
-        <w:t xml:space="preserve">We also want to continue to develop our maps page, as we began work on this page </w:t>
-      </w:r>
-      <w:r>
-        <w:rPr>
-          <w:rFonts w:ascii="Times New Roman" w:hAnsi="Times New Roman" w:cs="Times New Roman"/>
-        </w:rPr>
-        <w:t xml:space="preserve">later on in week 7. </w:t>
+        <w:t xml:space="preserve">We also want to continue to develop our maps page, as we began </w:t>
+      </w:r>
+      <w:proofErr w:type="gramStart"/>
+      <w:r>
+        <w:rPr>
+          <w:rFonts w:ascii="Times New Roman" w:hAnsi="Times New Roman" w:cs="Times New Roman"/>
+        </w:rPr>
+        <w:t>work</w:t>
+      </w:r>
+      <w:proofErr w:type="gramEnd"/>
+      <w:r>
+        <w:rPr>
+          <w:rFonts w:ascii="Times New Roman" w:hAnsi="Times New Roman" w:cs="Times New Roman"/>
+        </w:rPr>
+        <w:t xml:space="preserve"> on this page </w:t>
+      </w:r>
+      <w:proofErr w:type="gramStart"/>
+      <w:r>
+        <w:rPr>
+          <w:rFonts w:ascii="Times New Roman" w:hAnsi="Times New Roman" w:cs="Times New Roman"/>
+        </w:rPr>
+        <w:t>later on</w:t>
+      </w:r>
+      <w:proofErr w:type="gramEnd"/>
+      <w:r>
+        <w:rPr>
+          <w:rFonts w:ascii="Times New Roman" w:hAnsi="Times New Roman" w:cs="Times New Roman"/>
+        </w:rPr>
+        <w:t xml:space="preserve"> in week 7. </w:t>
       </w:r>
     </w:p>
     <w:p>

</xml_diff>

<commit_message>
cooked report, finished it
</commit_message>
<xml_diff>
--- a/Documentation/Weekly Report/week7/CMSC-4920-Week7Report-Group2.docx
+++ b/Documentation/Weekly Report/week7/CMSC-4920-Week7Report-Group2.docx
@@ -854,8 +854,6 @@
       </w:sdtPr>
       <w:sdtEndPr>
         <w:rPr>
-          <w:b/>
-          <w:bCs/>
           <w:noProof/>
         </w:rPr>
       </w:sdtEndPr>
@@ -914,7 +912,7 @@
             </w:rPr>
             <w:fldChar w:fldCharType="separate"/>
           </w:r>
-          <w:hyperlink w:anchor="_Toc223085456" w:history="1">
+          <w:hyperlink w:anchor="_Toc223197328" w:history="1">
             <w:r>
               <w:rPr>
                 <w:rStyle w:val="Hyperlink"/>
@@ -942,7 +940,7 @@
                 <w:noProof/>
                 <w:webHidden/>
               </w:rPr>
-              <w:instrText xml:space="preserve"> PAGEREF _Toc223085456 \h </w:instrText>
+              <w:instrText xml:space="preserve"> PAGEREF _Toc223197328 \h </w:instrText>
             </w:r>
             <w:r>
               <w:rPr>
@@ -984,7 +982,7 @@
               <w:noProof/>
             </w:rPr>
           </w:pPr>
-          <w:hyperlink w:anchor="_Toc223085457" w:history="1">
+          <w:hyperlink w:anchor="_Toc223197329" w:history="1">
             <w:r>
               <w:rPr>
                 <w:rStyle w:val="Hyperlink"/>
@@ -1012,7 +1010,7 @@
                 <w:noProof/>
                 <w:webHidden/>
               </w:rPr>
-              <w:instrText xml:space="preserve"> PAGEREF _Toc223085457 \h </w:instrText>
+              <w:instrText xml:space="preserve"> PAGEREF _Toc223197329 \h </w:instrText>
             </w:r>
             <w:r>
               <w:rPr>
@@ -1054,7 +1052,7 @@
               <w:noProof/>
             </w:rPr>
           </w:pPr>
-          <w:hyperlink w:anchor="_Toc223085458" w:history="1">
+          <w:hyperlink w:anchor="_Toc223197330" w:history="1">
             <w:r>
               <w:rPr>
                 <w:rStyle w:val="Hyperlink"/>
@@ -1082,7 +1080,7 @@
                 <w:noProof/>
                 <w:webHidden/>
               </w:rPr>
-              <w:instrText xml:space="preserve"> PAGEREF _Toc223085458 \h </w:instrText>
+              <w:instrText xml:space="preserve"> PAGEREF _Toc223197330 \h </w:instrText>
             </w:r>
             <w:r>
               <w:rPr>
@@ -1102,7 +1100,7 @@
                 <w:noProof/>
                 <w:webHidden/>
               </w:rPr>
-              <w:t>3</w:t>
+              <w:t>4</w:t>
             </w:r>
             <w:r>
               <w:rPr>
@@ -1124,7 +1122,7 @@
               <w:noProof/>
             </w:rPr>
           </w:pPr>
-          <w:hyperlink w:anchor="_Toc223085459" w:history="1">
+          <w:hyperlink w:anchor="_Toc223197331" w:history="1">
             <w:r>
               <w:rPr>
                 <w:rStyle w:val="Hyperlink"/>
@@ -1152,7 +1150,7 @@
                 <w:noProof/>
                 <w:webHidden/>
               </w:rPr>
-              <w:instrText xml:space="preserve"> PAGEREF _Toc223085459 \h </w:instrText>
+              <w:instrText xml:space="preserve"> PAGEREF _Toc223197331 \h </w:instrText>
             </w:r>
             <w:r>
               <w:rPr>
@@ -1172,7 +1170,7 @@
                 <w:noProof/>
                 <w:webHidden/>
               </w:rPr>
-              <w:t>3</w:t>
+              <w:t>4</w:t>
             </w:r>
             <w:r>
               <w:rPr>
@@ -1194,7 +1192,7 @@
               <w:noProof/>
             </w:rPr>
           </w:pPr>
-          <w:hyperlink w:anchor="_Toc223085460" w:history="1">
+          <w:hyperlink w:anchor="_Toc223197332" w:history="1">
             <w:r>
               <w:rPr>
                 <w:rStyle w:val="Hyperlink"/>
@@ -1222,7 +1220,7 @@
                 <w:noProof/>
                 <w:webHidden/>
               </w:rPr>
-              <w:instrText xml:space="preserve"> PAGEREF _Toc223085460 \h </w:instrText>
+              <w:instrText xml:space="preserve"> PAGEREF _Toc223197332 \h </w:instrText>
             </w:r>
             <w:r>
               <w:rPr>
@@ -1242,7 +1240,7 @@
                 <w:noProof/>
                 <w:webHidden/>
               </w:rPr>
-              <w:t>4</w:t>
+              <w:t>5</w:t>
             </w:r>
             <w:r>
               <w:rPr>
@@ -1264,7 +1262,7 @@
               <w:noProof/>
             </w:rPr>
           </w:pPr>
-          <w:hyperlink w:anchor="_Toc223085461" w:history="1">
+          <w:hyperlink w:anchor="_Toc223197333" w:history="1">
             <w:r>
               <w:rPr>
                 <w:rStyle w:val="Hyperlink"/>
@@ -1292,7 +1290,7 @@
                 <w:noProof/>
                 <w:webHidden/>
               </w:rPr>
-              <w:instrText xml:space="preserve"> PAGEREF _Toc223085461 \h </w:instrText>
+              <w:instrText xml:space="preserve"> PAGEREF _Toc223197333 \h </w:instrText>
             </w:r>
             <w:r>
               <w:rPr>
@@ -1312,7 +1310,7 @@
                 <w:noProof/>
                 <w:webHidden/>
               </w:rPr>
-              <w:t>5</w:t>
+              <w:t>7</w:t>
             </w:r>
             <w:r>
               <w:rPr>
@@ -1334,7 +1332,7 @@
               <w:noProof/>
             </w:rPr>
           </w:pPr>
-          <w:hyperlink w:anchor="_Toc223085462" w:history="1">
+          <w:hyperlink w:anchor="_Toc223197334" w:history="1">
             <w:r>
               <w:rPr>
                 <w:rStyle w:val="Hyperlink"/>
@@ -1362,7 +1360,7 @@
                 <w:noProof/>
                 <w:webHidden/>
               </w:rPr>
-              <w:instrText xml:space="preserve"> PAGEREF _Toc223085462 \h </w:instrText>
+              <w:instrText xml:space="preserve"> PAGEREF _Toc223197334 \h </w:instrText>
             </w:r>
             <w:r>
               <w:rPr>
@@ -1382,7 +1380,7 @@
                 <w:noProof/>
                 <w:webHidden/>
               </w:rPr>
-              <w:t>5</w:t>
+              <w:t>7</w:t>
             </w:r>
             <w:r>
               <w:rPr>
@@ -1404,7 +1402,7 @@
               <w:noProof/>
             </w:rPr>
           </w:pPr>
-          <w:hyperlink w:anchor="_Toc223085463" w:history="1">
+          <w:hyperlink w:anchor="_Toc223197335" w:history="1">
             <w:r>
               <w:rPr>
                 <w:rStyle w:val="Hyperlink"/>
@@ -1432,7 +1430,7 @@
                 <w:noProof/>
                 <w:webHidden/>
               </w:rPr>
-              <w:instrText xml:space="preserve"> PAGEREF _Toc223085463 \h </w:instrText>
+              <w:instrText xml:space="preserve"> PAGEREF _Toc223197335 \h </w:instrText>
             </w:r>
             <w:r>
               <w:rPr>
@@ -1452,7 +1450,77 @@
                 <w:noProof/>
                 <w:webHidden/>
               </w:rPr>
-              <w:t>6</w:t>
+              <w:t>8</w:t>
+            </w:r>
+            <w:r>
+              <w:rPr>
+                <w:noProof/>
+                <w:webHidden/>
+              </w:rPr>
+              <w:fldChar w:fldCharType="end"/>
+            </w:r>
+          </w:hyperlink>
+        </w:p>
+        <w:p>
+          <w:pPr>
+            <w:pStyle w:val="TOC1"/>
+            <w:tabs>
+              <w:tab w:val="right" w:leader="dot" w:pos="9350"/>
+            </w:tabs>
+            <w:rPr>
+              <w:rFonts w:eastAsiaTheme="minorEastAsia"/>
+              <w:noProof/>
+            </w:rPr>
+          </w:pPr>
+          <w:hyperlink w:anchor="_Toc223197336" w:history="1">
+            <w:r>
+              <w:rPr>
+                <w:rStyle w:val="Hyperlink"/>
+                <w:rFonts w:ascii="Times New Roman" w:hAnsi="Times New Roman" w:cs="Times New Roman"/>
+                <w:noProof/>
+              </w:rPr>
+              <w:t>References</w:t>
+            </w:r>
+            <w:r>
+              <w:rPr>
+                <w:noProof/>
+                <w:webHidden/>
+              </w:rPr>
+              <w:tab/>
+            </w:r>
+            <w:r>
+              <w:rPr>
+                <w:noProof/>
+                <w:webHidden/>
+              </w:rPr>
+              <w:fldChar w:fldCharType="begin"/>
+            </w:r>
+            <w:r>
+              <w:rPr>
+                <w:noProof/>
+                <w:webHidden/>
+              </w:rPr>
+              <w:instrText xml:space="preserve"> PAGEREF _Toc223197336 \h </w:instrText>
+            </w:r>
+            <w:r>
+              <w:rPr>
+                <w:noProof/>
+                <w:webHidden/>
+              </w:rPr>
+            </w:r>
+            <w:r>
+              <w:rPr>
+                <w:noProof/>
+                <w:webHidden/>
+              </w:rPr>
+              <w:fldChar w:fldCharType="separate"/>
+            </w:r>
+            <w:r>
+              <w:rPr>
+                <w:noProof/>
+                <w:webHidden/>
+              </w:rPr>
+              <w:t>8</w:t>
             </w:r>
             <w:r>
               <w:rPr>
@@ -1493,7 +1561,6 @@
     <w:p/>
     <w:p/>
     <w:p/>
-    <w:p/>
     <w:p>
       <w:pPr>
         <w:pStyle w:val="Heading1"/>
@@ -1504,7 +1571,7 @@
           <w:szCs w:val="24"/>
         </w:rPr>
       </w:pPr>
-      <w:bookmarkStart w:id="0" w:name="_Toc223085456"/>
+      <w:bookmarkStart w:id="0" w:name="_Toc223197328"/>
       <w:r>
         <w:rPr>
           <w:rFonts w:ascii="Times New Roman" w:hAnsi="Times New Roman" w:cs="Times New Roman"/>
@@ -1698,28 +1765,24 @@
         </w:rPr>
         <w:t xml:space="preserve">not allowing access to the tracker before a user is properly logged </w:t>
       </w:r>
-      <w:proofErr w:type="gramStart"/>
-      <w:r>
-        <w:rPr>
-          <w:rFonts w:ascii="Times New Roman" w:hAnsi="Times New Roman" w:cs="Times New Roman"/>
-        </w:rPr>
-        <w:t>in,</w:t>
-      </w:r>
-      <w:proofErr w:type="gramEnd"/>
+      <w:r>
+        <w:rPr>
+          <w:rFonts w:ascii="Times New Roman" w:hAnsi="Times New Roman" w:cs="Times New Roman"/>
+        </w:rPr>
+        <w:t>in</w:t>
+      </w:r>
       <w:r>
         <w:rPr>
           <w:rFonts w:ascii="Times New Roman" w:hAnsi="Times New Roman" w:cs="Times New Roman"/>
         </w:rPr>
         <w:t xml:space="preserve"> was the main goal of this week. Achieving this goal will help </w:t>
       </w:r>
-      <w:proofErr w:type="gramStart"/>
-      <w:r>
-        <w:rPr>
-          <w:rFonts w:ascii="Times New Roman" w:hAnsi="Times New Roman" w:cs="Times New Roman"/>
-        </w:rPr>
-        <w:t>upkeep</w:t>
-      </w:r>
-      <w:proofErr w:type="gramEnd"/>
+      <w:r>
+        <w:rPr>
+          <w:rFonts w:ascii="Times New Roman" w:hAnsi="Times New Roman" w:cs="Times New Roman"/>
+        </w:rPr>
+        <w:t>keep</w:t>
+      </w:r>
       <w:r>
         <w:rPr>
           <w:rFonts w:ascii="Times New Roman" w:hAnsi="Times New Roman" w:cs="Times New Roman"/>
@@ -1739,7 +1802,7 @@
           <w:szCs w:val="24"/>
         </w:rPr>
       </w:pPr>
-      <w:bookmarkStart w:id="1" w:name="_Toc223085457"/>
+      <w:bookmarkStart w:id="1" w:name="_Toc223197329"/>
       <w:r>
         <w:rPr>
           <w:rFonts w:ascii="Times New Roman" w:hAnsi="Times New Roman" w:cs="Times New Roman"/>
@@ -1961,19 +2024,264 @@
         <w:tab/>
         <w:t xml:space="preserve">The fourth goal accomplished this week was the further development of the challenges page. A user can now join and leave </w:t>
       </w:r>
-      <w:proofErr w:type="gramStart"/>
-      <w:r>
-        <w:rPr>
-          <w:rFonts w:ascii="Times New Roman" w:hAnsi="Times New Roman" w:cs="Times New Roman"/>
-        </w:rPr>
-        <w:t>challenges,</w:t>
-      </w:r>
-      <w:proofErr w:type="gramEnd"/>
+      <w:r>
+        <w:rPr>
+          <w:rFonts w:ascii="Times New Roman" w:hAnsi="Times New Roman" w:cs="Times New Roman"/>
+        </w:rPr>
+        <w:t>challenges;</w:t>
+      </w:r>
       <w:r>
         <w:rPr>
           <w:rFonts w:ascii="Times New Roman" w:hAnsi="Times New Roman" w:cs="Times New Roman"/>
         </w:rPr>
         <w:t xml:space="preserve"> a user can also delete a challenge if they are the creator of the challenge. Users can now also view individual challenge details page that will display the challenges description, participant count, and more.</w:t>
+      </w:r>
+    </w:p>
+    <w:p>
+      <w:pPr>
+        <w:spacing w:line="480" w:lineRule="auto"/>
+        <w:ind w:firstLine="720"/>
+        <w:rPr>
+          <w:rFonts w:ascii="Times New Roman" w:hAnsi="Times New Roman" w:cs="Times New Roman"/>
+        </w:rPr>
+      </w:pPr>
+      <w:r>
+        <w:rPr>
+          <w:rFonts w:ascii="Times New Roman" w:hAnsi="Times New Roman" w:cs="Times New Roman"/>
+        </w:rPr>
+        <w:t xml:space="preserve">Initialization </w:t>
+      </w:r>
+      <w:r>
+        <w:rPr>
+          <w:rFonts w:ascii="Times New Roman" w:hAnsi="Times New Roman" w:cs="Times New Roman"/>
+        </w:rPr>
+        <w:t>of the maps page was the final feature and fifth goal of week 7</w:t>
+      </w:r>
+      <w:r>
+        <w:rPr>
+          <w:rFonts w:ascii="Times New Roman" w:hAnsi="Times New Roman" w:cs="Times New Roman"/>
+        </w:rPr>
+        <w:t xml:space="preserve">. Considerable team time was spent to research and find the best free option of Map API. We needed this to connect our Vulcan </w:t>
+      </w:r>
+      <w:r>
+        <w:rPr>
+          <w:rFonts w:ascii="Times New Roman" w:hAnsi="Times New Roman" w:cs="Times New Roman"/>
+        </w:rPr>
+        <w:t>T</w:t>
+      </w:r>
+      <w:r>
+        <w:rPr>
+          <w:rFonts w:ascii="Times New Roman" w:hAnsi="Times New Roman" w:cs="Times New Roman"/>
+        </w:rPr>
+        <w:t xml:space="preserve">racker to an internet map viewer </w:t>
+      </w:r>
+      <w:r>
+        <w:rPr>
+          <w:rFonts w:ascii="Times New Roman" w:hAnsi="Times New Roman" w:cs="Times New Roman"/>
+        </w:rPr>
+        <w:t xml:space="preserve">such as the </w:t>
+      </w:r>
+      <w:r>
+        <w:rPr>
+          <w:rFonts w:ascii="Times New Roman" w:hAnsi="Times New Roman" w:cs="Times New Roman"/>
+        </w:rPr>
+        <w:t>google maps</w:t>
+      </w:r>
+      <w:r>
+        <w:rPr>
+          <w:rFonts w:ascii="Times New Roman" w:hAnsi="Times New Roman" w:cs="Times New Roman"/>
+        </w:rPr>
+        <w:t xml:space="preserve"> viewer</w:t>
+      </w:r>
+      <w:r>
+        <w:rPr>
+          <w:rFonts w:ascii="Times New Roman" w:hAnsi="Times New Roman" w:cs="Times New Roman"/>
+        </w:rPr>
+        <w:t>.</w:t>
+      </w:r>
+      <w:r>
+        <w:rPr>
+          <w:rFonts w:ascii="Times New Roman" w:hAnsi="Times New Roman" w:cs="Times New Roman"/>
+        </w:rPr>
+        <w:t xml:space="preserve"> Since </w:t>
+      </w:r>
+      <w:r>
+        <w:rPr>
+          <w:rFonts w:ascii="Times New Roman" w:hAnsi="Times New Roman" w:cs="Times New Roman"/>
+        </w:rPr>
+        <w:t xml:space="preserve">our project remains on tight budgeting and senior project scale, it was </w:t>
+      </w:r>
+      <w:r>
+        <w:rPr>
+          <w:rFonts w:ascii="Times New Roman" w:hAnsi="Times New Roman" w:cs="Times New Roman"/>
+        </w:rPr>
+        <w:t xml:space="preserve">both important and required to find </w:t>
+      </w:r>
+      <w:r>
+        <w:rPr>
+          <w:rFonts w:ascii="Times New Roman" w:hAnsi="Times New Roman" w:cs="Times New Roman"/>
+        </w:rPr>
+        <w:t>a</w:t>
+      </w:r>
+      <w:r>
+        <w:rPr>
+          <w:rFonts w:ascii="Times New Roman" w:hAnsi="Times New Roman" w:cs="Times New Roman"/>
+        </w:rPr>
+        <w:t xml:space="preserve"> free student accessible version. </w:t>
+      </w:r>
+      <w:r>
+        <w:rPr>
+          <w:rFonts w:ascii="Times New Roman" w:hAnsi="Times New Roman" w:cs="Times New Roman"/>
+        </w:rPr>
+        <w:t xml:space="preserve"> An </w:t>
+      </w:r>
+      <w:r>
+        <w:rPr>
+          <w:rFonts w:ascii="Times New Roman" w:hAnsi="Times New Roman" w:cs="Times New Roman"/>
+        </w:rPr>
+        <w:t>open-source</w:t>
+      </w:r>
+      <w:r>
+        <w:rPr>
+          <w:rFonts w:ascii="Times New Roman" w:hAnsi="Times New Roman" w:cs="Times New Roman"/>
+        </w:rPr>
+        <w:t xml:space="preserve"> option was found, Leaflet (2025). This is a JavaScript </w:t>
+      </w:r>
+      <w:r>
+        <w:rPr>
+          <w:rFonts w:ascii="Times New Roman" w:hAnsi="Times New Roman" w:cs="Times New Roman"/>
+        </w:rPr>
+        <w:t xml:space="preserve">library available to developers for free with no additional fees or account creation. </w:t>
+      </w:r>
+      <w:r>
+        <w:rPr>
+          <w:rFonts w:ascii="Times New Roman" w:hAnsi="Times New Roman" w:cs="Times New Roman"/>
+        </w:rPr>
+        <w:t xml:space="preserve">Simply including web API link at the top of our files, we were able to use this </w:t>
+      </w:r>
+      <w:r>
+        <w:rPr>
+          <w:rFonts w:ascii="Times New Roman" w:hAnsi="Times New Roman" w:cs="Times New Roman"/>
+        </w:rPr>
+        <w:t>site’s</w:t>
+      </w:r>
+      <w:r>
+        <w:rPr>
+          <w:rFonts w:ascii="Times New Roman" w:hAnsi="Times New Roman" w:cs="Times New Roman"/>
+        </w:rPr>
+        <w:t xml:space="preserve"> documentation to build an interactive map feature. </w:t>
+      </w:r>
+      <w:r>
+        <w:rPr>
+          <w:rFonts w:ascii="Times New Roman" w:hAnsi="Times New Roman" w:cs="Times New Roman"/>
+        </w:rPr>
+        <w:t>Leaflet presented a learning curve</w:t>
+      </w:r>
+      <w:r>
+        <w:rPr>
+          <w:rFonts w:ascii="Times New Roman" w:hAnsi="Times New Roman" w:cs="Times New Roman"/>
+        </w:rPr>
+        <w:t xml:space="preserve"> since the map </w:t>
+      </w:r>
+      <w:r>
+        <w:rPr>
+          <w:rFonts w:ascii="Times New Roman" w:hAnsi="Times New Roman" w:cs="Times New Roman"/>
+        </w:rPr>
+        <w:t xml:space="preserve">feature requires coordinates to be entered. Through careful testing, </w:t>
+      </w:r>
+      <w:r>
+        <w:rPr>
+          <w:rFonts w:ascii="Times New Roman" w:hAnsi="Times New Roman" w:cs="Times New Roman"/>
+        </w:rPr>
+        <w:t>our team formulated a system of storing these coordinates in arrays to be stored and used later.</w:t>
+      </w:r>
+    </w:p>
+    <w:p>
+      <w:pPr>
+        <w:spacing w:line="480" w:lineRule="auto"/>
+        <w:ind w:firstLine="720"/>
+        <w:rPr>
+          <w:rFonts w:ascii="Times New Roman" w:hAnsi="Times New Roman" w:cs="Times New Roman"/>
+        </w:rPr>
+      </w:pPr>
+      <w:r>
+        <w:rPr>
+          <w:rFonts w:ascii="Times New Roman" w:hAnsi="Times New Roman" w:cs="Times New Roman"/>
+        </w:rPr>
+        <w:t>Users can now plan outdoor exercise route</w:t>
+      </w:r>
+      <w:r>
+        <w:rPr>
+          <w:rFonts w:ascii="Times New Roman" w:hAnsi="Times New Roman" w:cs="Times New Roman"/>
+        </w:rPr>
+        <w:t xml:space="preserve">. They can view premade routes stored </w:t>
+      </w:r>
+      <w:r>
+        <w:rPr>
+          <w:rFonts w:ascii="Times New Roman" w:hAnsi="Times New Roman" w:cs="Times New Roman"/>
+        </w:rPr>
+        <w:t>in the Vulcan Activity Tracker or they can draw their own route on the map. These routes are then stored by the name the user entered and linked to their user id. This allows routes to be displayed when the user logs back into the app or moves between platform pages.</w:t>
+      </w:r>
+      <w:r>
+        <w:rPr>
+          <w:rFonts w:ascii="Times New Roman" w:hAnsi="Times New Roman" w:cs="Times New Roman"/>
+        </w:rPr>
+        <w:t xml:space="preserve"> Careful design considerations went into this map feature. As a user </w:t>
+      </w:r>
+      <w:r>
+        <w:rPr>
+          <w:rFonts w:ascii="Times New Roman" w:hAnsi="Times New Roman" w:cs="Times New Roman"/>
+        </w:rPr>
+        <w:t xml:space="preserve">draws a path, markers are displayed to show </w:t>
+      </w:r>
+      <w:r>
+        <w:rPr>
+          <w:rFonts w:ascii="Times New Roman" w:hAnsi="Times New Roman" w:cs="Times New Roman"/>
+        </w:rPr>
+        <w:lastRenderedPageBreak/>
+        <w:t xml:space="preserve">where the user clicked, however, upon saving the route, the markers are removed to show the completed path. The map feature is </w:t>
+      </w:r>
+      <w:r>
+        <w:rPr>
+          <w:rFonts w:ascii="Times New Roman" w:hAnsi="Times New Roman" w:cs="Times New Roman"/>
+        </w:rPr>
+        <w:t xml:space="preserve">additionally set to the </w:t>
+      </w:r>
+      <w:r>
+        <w:rPr>
+          <w:rFonts w:ascii="Times New Roman" w:hAnsi="Times New Roman" w:cs="Times New Roman"/>
+        </w:rPr>
+        <w:t>initial</w:t>
+      </w:r>
+      <w:r>
+        <w:rPr>
+          <w:rFonts w:ascii="Times New Roman" w:hAnsi="Times New Roman" w:cs="Times New Roman"/>
+        </w:rPr>
+        <w:t xml:space="preserve"> coordinates of PennWest California campus. The view can be zoomed in or out to show different locations, however</w:t>
+      </w:r>
+      <w:r>
+        <w:rPr>
+          <w:rFonts w:ascii="Times New Roman" w:hAnsi="Times New Roman" w:cs="Times New Roman"/>
+        </w:rPr>
+        <w:t xml:space="preserve">, our university is the primary location for the map and overall student use case. </w:t>
+      </w:r>
+      <w:r>
+        <w:rPr>
+          <w:rFonts w:ascii="Times New Roman" w:hAnsi="Times New Roman" w:cs="Times New Roman"/>
+        </w:rPr>
+        <w:t>Map m</w:t>
+      </w:r>
+      <w:r>
+        <w:rPr>
+          <w:rFonts w:ascii="Times New Roman" w:hAnsi="Times New Roman" w:cs="Times New Roman"/>
+        </w:rPr>
+        <w:t xml:space="preserve">arkers </w:t>
+      </w:r>
+      <w:r>
+        <w:rPr>
+          <w:rFonts w:ascii="Times New Roman" w:hAnsi="Times New Roman" w:cs="Times New Roman"/>
+        </w:rPr>
+        <w:t>display information for users to view.</w:t>
       </w:r>
     </w:p>
     <w:p>
@@ -1988,7 +2296,7 @@
           <w:szCs w:val="24"/>
         </w:rPr>
       </w:pPr>
-      <w:bookmarkStart w:id="2" w:name="_Toc223085458"/>
+      <w:bookmarkStart w:id="2" w:name="_Toc223197330"/>
       <w:r>
         <w:rPr>
           <w:rFonts w:ascii="Times New Roman" w:hAnsi="Times New Roman" w:cs="Times New Roman"/>
@@ -2145,14 +2453,12 @@
         </w:rPr>
         <w:t xml:space="preserve">. Through lots of </w:t>
       </w:r>
-      <w:proofErr w:type="gramStart"/>
-      <w:r>
-        <w:rPr>
-          <w:rFonts w:ascii="Times New Roman" w:hAnsi="Times New Roman" w:cs="Times New Roman"/>
-        </w:rPr>
-        <w:t>debugging</w:t>
-      </w:r>
-      <w:proofErr w:type="gramEnd"/>
+      <w:r>
+        <w:rPr>
+          <w:rFonts w:ascii="Times New Roman" w:hAnsi="Times New Roman" w:cs="Times New Roman"/>
+        </w:rPr>
+        <w:t>debugging,</w:t>
+      </w:r>
       <w:r>
         <w:rPr>
           <w:rFonts w:ascii="Times New Roman" w:hAnsi="Times New Roman" w:cs="Times New Roman"/>
@@ -2191,7 +2497,7 @@
           <w:szCs w:val="24"/>
         </w:rPr>
       </w:pPr>
-      <w:bookmarkStart w:id="3" w:name="_Toc223085459"/>
+      <w:bookmarkStart w:id="3" w:name="_Toc223197331"/>
       <w:r>
         <w:rPr>
           <w:rFonts w:ascii="Times New Roman" w:hAnsi="Times New Roman" w:cs="Times New Roman"/>
@@ -2205,72 +2511,192 @@
       </w:r>
       <w:bookmarkEnd w:id="3"/>
     </w:p>
-    <w:p/>
     <w:p>
       <w:pPr>
-        <w:pStyle w:val="ListParagraph"/>
-        <w:numPr>
-          <w:ilvl w:val="0"/>
-          <w:numId w:val="13"/>
-        </w:numPr>
-        <w:rPr>
-          <w:rFonts w:ascii="Times New Roman" w:hAnsi="Times New Roman" w:cs="Times New Roman"/>
-        </w:rPr>
-      </w:pPr>
-      <w:r>
-        <w:rPr>
-          <w:rFonts w:ascii="Times New Roman" w:hAnsi="Times New Roman" w:cs="Times New Roman"/>
-        </w:rPr>
-        <w:t>A</w:t>
+        <w:spacing w:line="480" w:lineRule="auto"/>
+        <w:ind w:firstLine="360"/>
+        <w:rPr>
+          <w:rFonts w:ascii="Times New Roman" w:hAnsi="Times New Roman" w:cs="Times New Roman"/>
+        </w:rPr>
+      </w:pPr>
+      <w:r>
+        <w:rPr>
+          <w:rFonts w:ascii="Times New Roman" w:hAnsi="Times New Roman" w:cs="Times New Roman"/>
+        </w:rPr>
+        <w:t xml:space="preserve">1. </w:t>
+      </w:r>
+      <w:r>
+        <w:rPr>
+          <w:rFonts w:ascii="Times New Roman" w:hAnsi="Times New Roman" w:cs="Times New Roman"/>
+        </w:rPr>
+        <w:t>Ensuring that users are not able to route past the app’s login right to the dashboard was quite difficult. A Wrapper function called login_required was initialized.</w:t>
+      </w:r>
+      <w:r>
+        <w:rPr>
+          <w:rFonts w:ascii="Times New Roman" w:hAnsi="Times New Roman" w:cs="Times New Roman"/>
+        </w:rPr>
+        <w:t xml:space="preserve"> It locks down all page routing until a valid user id enters the login session. Each </w:t>
+      </w:r>
+      <w:r>
+        <w:rPr>
+          <w:rFonts w:ascii="Times New Roman" w:hAnsi="Times New Roman" w:cs="Times New Roman"/>
+        </w:rPr>
+        <w:t xml:space="preserve">API is then wrapped in this function to block any functionality. </w:t>
+      </w:r>
+      <w:r>
+        <w:rPr>
+          <w:rFonts w:ascii="Times New Roman" w:hAnsi="Times New Roman" w:cs="Times New Roman"/>
+        </w:rPr>
+        <w:t xml:space="preserve">Additionally, every dynamic page route is set to private. The only pages that can be viewed without app entry </w:t>
+      </w:r>
+      <w:r>
+        <w:rPr>
+          <w:rFonts w:ascii="Times New Roman" w:hAnsi="Times New Roman" w:cs="Times New Roman"/>
+        </w:rPr>
+        <w:t>are</w:t>
+      </w:r>
+      <w:r>
+        <w:rPr>
+          <w:rFonts w:ascii="Times New Roman" w:hAnsi="Times New Roman" w:cs="Times New Roman"/>
+        </w:rPr>
+        <w:t xml:space="preserve"> the welcome and login pages. Upon logout, the user id is removed from session storage to ensure that the application is locked again. This solution was of great precedence</w:t>
+      </w:r>
+      <w:r>
+        <w:rPr>
+          <w:rFonts w:ascii="Times New Roman" w:hAnsi="Times New Roman" w:cs="Times New Roman"/>
+        </w:rPr>
+        <w:t xml:space="preserve"> since it ensure</w:t>
+      </w:r>
+      <w:r>
+        <w:rPr>
+          <w:rFonts w:ascii="Times New Roman" w:hAnsi="Times New Roman" w:cs="Times New Roman"/>
+        </w:rPr>
+        <w:t xml:space="preserve">s </w:t>
+      </w:r>
+      <w:r>
+        <w:rPr>
+          <w:rFonts w:ascii="Times New Roman" w:hAnsi="Times New Roman" w:cs="Times New Roman"/>
+        </w:rPr>
+        <w:t>user and app safety.</w:t>
       </w:r>
     </w:p>
     <w:p>
       <w:pPr>
-        <w:pStyle w:val="ListParagraph"/>
-        <w:numPr>
-          <w:ilvl w:val="0"/>
-          <w:numId w:val="13"/>
-        </w:numPr>
-        <w:rPr>
-          <w:rFonts w:ascii="Times New Roman" w:hAnsi="Times New Roman" w:cs="Times New Roman"/>
-        </w:rPr>
-      </w:pPr>
-      <w:r>
-        <w:rPr>
-          <w:rFonts w:ascii="Times New Roman" w:hAnsi="Times New Roman" w:cs="Times New Roman"/>
-        </w:rPr>
-        <w:t>B</w:t>
+        <w:spacing w:line="480" w:lineRule="auto"/>
+        <w:ind w:firstLine="360"/>
+        <w:rPr>
+          <w:rFonts w:ascii="Times New Roman" w:hAnsi="Times New Roman" w:cs="Times New Roman"/>
+        </w:rPr>
+      </w:pPr>
+      <w:r>
+        <w:rPr>
+          <w:rFonts w:ascii="Times New Roman" w:hAnsi="Times New Roman" w:cs="Times New Roman"/>
+        </w:rPr>
+        <w:lastRenderedPageBreak/>
+        <w:t xml:space="preserve">2. </w:t>
+      </w:r>
+      <w:r>
+        <w:rPr>
+          <w:rFonts w:ascii="Times New Roman" w:hAnsi="Times New Roman" w:cs="Times New Roman"/>
+        </w:rPr>
+        <w:t xml:space="preserve">A solution </w:t>
+      </w:r>
+      <w:r>
+        <w:rPr>
+          <w:rFonts w:ascii="Times New Roman" w:hAnsi="Times New Roman" w:cs="Times New Roman"/>
+        </w:rPr>
+        <w:t xml:space="preserve">to the use of local storage came along with the securing of routes. User session storage was finally implemented. This means that the user that logged in, their </w:t>
+      </w:r>
+      <w:r>
+        <w:rPr>
+          <w:rFonts w:ascii="Times New Roman" w:hAnsi="Times New Roman" w:cs="Times New Roman"/>
+        </w:rPr>
+        <w:t>username</w:t>
+      </w:r>
+      <w:r>
+        <w:rPr>
+          <w:rFonts w:ascii="Times New Roman" w:hAnsi="Times New Roman" w:cs="Times New Roman"/>
+        </w:rPr>
+        <w:t xml:space="preserve"> is stored on the server side of the platform instead of the client side. Removing the use of local storage eliminated the ability of </w:t>
+      </w:r>
+      <w:r>
+        <w:rPr>
+          <w:rFonts w:ascii="Times New Roman" w:hAnsi="Times New Roman" w:cs="Times New Roman"/>
+        </w:rPr>
+        <w:t xml:space="preserve">the Cross Site Scripting attack (XSS), when an attack injects malicious code into an applications JS or HTML to retrieve data. This week 7 </w:t>
+      </w:r>
+      <w:r>
+        <w:rPr>
+          <w:rFonts w:ascii="Times New Roman" w:hAnsi="Times New Roman" w:cs="Times New Roman"/>
+        </w:rPr>
+        <w:t>revision</w:t>
+      </w:r>
+      <w:r>
+        <w:rPr>
+          <w:rFonts w:ascii="Times New Roman" w:hAnsi="Times New Roman" w:cs="Times New Roman"/>
+        </w:rPr>
+        <w:t xml:space="preserve"> moved our app towards cybersecurity compliance.</w:t>
       </w:r>
     </w:p>
     <w:p>
       <w:pPr>
-        <w:pStyle w:val="ListParagraph"/>
-        <w:numPr>
-          <w:ilvl w:val="0"/>
-          <w:numId w:val="13"/>
-        </w:numPr>
-        <w:rPr>
-          <w:rFonts w:ascii="Times New Roman" w:hAnsi="Times New Roman" w:cs="Times New Roman"/>
-        </w:rPr>
-      </w:pPr>
-      <w:r>
-        <w:rPr>
-          <w:rFonts w:ascii="Times New Roman" w:hAnsi="Times New Roman" w:cs="Times New Roman"/>
-        </w:rPr>
-        <w:t>C</w:t>
+        <w:spacing w:line="480" w:lineRule="auto"/>
+        <w:ind w:firstLine="360"/>
+        <w:rPr>
+          <w:rFonts w:ascii="Times New Roman" w:hAnsi="Times New Roman" w:cs="Times New Roman"/>
+        </w:rPr>
+      </w:pPr>
+      <w:r>
+        <w:rPr>
+          <w:rFonts w:ascii="Times New Roman" w:hAnsi="Times New Roman" w:cs="Times New Roman"/>
+        </w:rPr>
+        <w:t xml:space="preserve">3. </w:t>
+      </w:r>
+      <w:r>
+        <w:rPr>
+          <w:rFonts w:ascii="Times New Roman" w:hAnsi="Times New Roman" w:cs="Times New Roman"/>
+        </w:rPr>
+        <w:t>Email Password recovery still remains unsolved</w:t>
+      </w:r>
+      <w:r>
+        <w:rPr>
+          <w:rFonts w:ascii="Times New Roman" w:hAnsi="Times New Roman" w:cs="Times New Roman"/>
+        </w:rPr>
+        <w:t xml:space="preserve">. However, </w:t>
+      </w:r>
+      <w:r>
+        <w:rPr>
+          <w:rFonts w:ascii="Times New Roman" w:hAnsi="Times New Roman" w:cs="Times New Roman"/>
+        </w:rPr>
+        <w:t xml:space="preserve">considerable progress has been made on research, initial setup of UI entry fields, and </w:t>
+      </w:r>
+      <w:r>
+        <w:rPr>
+          <w:rFonts w:ascii="Times New Roman" w:hAnsi="Times New Roman" w:cs="Times New Roman"/>
+        </w:rPr>
+        <w:t>server-side</w:t>
+      </w:r>
+      <w:r>
+        <w:rPr>
+          <w:rFonts w:ascii="Times New Roman" w:hAnsi="Times New Roman" w:cs="Times New Roman"/>
+        </w:rPr>
+        <w:t xml:space="preserve"> logic.</w:t>
       </w:r>
     </w:p>
     <w:p>
       <w:pPr>
-        <w:pStyle w:val="ListParagraph"/>
-        <w:numPr>
-          <w:ilvl w:val="0"/>
-          <w:numId w:val="13"/>
-        </w:numPr>
-        <w:rPr>
-          <w:rFonts w:ascii="Times New Roman" w:hAnsi="Times New Roman" w:cs="Times New Roman"/>
-        </w:rPr>
-      </w:pPr>
+        <w:spacing w:line="480" w:lineRule="auto"/>
+        <w:ind w:firstLine="360"/>
+        <w:rPr>
+          <w:rFonts w:ascii="Times New Roman" w:hAnsi="Times New Roman" w:cs="Times New Roman"/>
+        </w:rPr>
+      </w:pPr>
+      <w:r>
+        <w:rPr>
+          <w:rFonts w:ascii="Times New Roman" w:hAnsi="Times New Roman" w:cs="Times New Roman"/>
+        </w:rPr>
+        <w:t xml:space="preserve">4. </w:t>
+      </w:r>
       <w:r>
         <w:rPr>
           <w:rFonts w:ascii="Times New Roman" w:hAnsi="Times New Roman" w:cs="Times New Roman"/>
@@ -2290,7 +2716,7 @@
           <w:szCs w:val="24"/>
         </w:rPr>
       </w:pPr>
-      <w:bookmarkStart w:id="4" w:name="_Toc223085460"/>
+      <w:bookmarkStart w:id="4" w:name="_Toc223197332"/>
       <w:r>
         <w:rPr>
           <w:rFonts w:ascii="Times New Roman" w:hAnsi="Times New Roman" w:cs="Times New Roman"/>
@@ -2300,7 +2726,6 @@
           <w:sz w:val="24"/>
           <w:szCs w:val="24"/>
         </w:rPr>
-        <w:lastRenderedPageBreak/>
         <w:t>Team Progress:</w:t>
       </w:r>
       <w:bookmarkEnd w:id="4"/>
@@ -2354,14 +2779,12 @@
         </w:rPr>
         <w:t xml:space="preserve">Another major step forward was conducting user testing. We had multiple users create </w:t>
       </w:r>
-      <w:proofErr w:type="gramStart"/>
-      <w:r>
-        <w:rPr>
-          <w:rFonts w:ascii="Times New Roman" w:hAnsi="Times New Roman" w:cs="Times New Roman"/>
-        </w:rPr>
-        <w:t>accounts, and</w:t>
-      </w:r>
-      <w:proofErr w:type="gramEnd"/>
+      <w:r>
+        <w:rPr>
+          <w:rFonts w:ascii="Times New Roman" w:hAnsi="Times New Roman" w:cs="Times New Roman"/>
+        </w:rPr>
+        <w:t>accounts and</w:t>
+      </w:r>
       <w:r>
         <w:rPr>
           <w:rFonts w:ascii="Times New Roman" w:hAnsi="Times New Roman" w:cs="Times New Roman"/>
@@ -2372,7 +2795,14 @@
         <w:rPr>
           <w:rFonts w:ascii="Times New Roman" w:hAnsi="Times New Roman" w:cs="Times New Roman"/>
         </w:rPr>
-        <w:t>s including activity tracking, leaderboard, clubs and challenges. The feedback from the test group was documented and compiled in a user feedback file that our whole team has access to. We believe although we are still months away from our tracker being a finished product, user testing is an extremely important and valuable process. This is because getting users without biases or technical knowledge to run through a program exposes issues the developers might not have previously considered. For example, one test user suggested a feature that has the users confirm the password they chose while making an account, a simple feature used is many applications to ensure the user didn’t accidentally mess up their wanted password, but for us developers who just want to log on to the application as fast as we can to test other features, we never thought of it.</w:t>
+        <w:t xml:space="preserve">s including activity tracking, leaderboard, clubs and challenges. The feedback from the test group was documented and compiled in a user feedback file that our whole team has access to. We believe although we are still months away from our tracker being a finished product, user testing is an extremely important and valuable process. This is because getting users without biases or technical </w:t>
+      </w:r>
+      <w:r>
+        <w:rPr>
+          <w:rFonts w:ascii="Times New Roman" w:hAnsi="Times New Roman" w:cs="Times New Roman"/>
+        </w:rPr>
+        <w:lastRenderedPageBreak/>
+        <w:t>knowledge to run through a program exposes issues the developers might not have previously considered. For example, one test user suggested a feature that has the users confirm the password they chose while making an account, a simple feature used is many applications to ensure the user didn’t accidentally mess up their wanted password, but for us developers who just want to log on to the application as fast as we can to test other features, we never thought of it.</w:t>
       </w:r>
     </w:p>
     <w:p>
@@ -2402,22 +2832,7 @@
         <w:rPr>
           <w:rFonts w:ascii="Times New Roman" w:hAnsi="Times New Roman" w:cs="Times New Roman"/>
         </w:rPr>
-        <w:lastRenderedPageBreak/>
-        <w:t xml:space="preserve">The last accomplishment of this week was the continued development of both our challenges and </w:t>
-      </w:r>
-      <w:proofErr w:type="gramStart"/>
-      <w:r>
-        <w:rPr>
-          <w:rFonts w:ascii="Times New Roman" w:hAnsi="Times New Roman" w:cs="Times New Roman"/>
-        </w:rPr>
-        <w:t>teams</w:t>
-      </w:r>
-      <w:proofErr w:type="gramEnd"/>
-      <w:r>
-        <w:rPr>
-          <w:rFonts w:ascii="Times New Roman" w:hAnsi="Times New Roman" w:cs="Times New Roman"/>
-        </w:rPr>
-        <w:t xml:space="preserve"> pages. The development of both is moving at a slow but steady pace as we are trying to link the activity data and the frontend to present </w:t>
+        <w:t xml:space="preserve">The last accomplishment of this week was the continued development of both our challenges and teams pages. The development of both is moving at a slow but steady pace as we are trying to link the activity data and the frontend to present </w:t>
       </w:r>
       <w:proofErr w:type="gramStart"/>
       <w:r>
@@ -2471,12 +2886,8 @@
           <w:szCs w:val="24"/>
         </w:rPr>
       </w:pPr>
-      <w:bookmarkStart w:id="5" w:name="_Toc223085461"/>
-    </w:p>
-    <w:p>
-      <w:pPr>
-        <w:pStyle w:val="Heading1"/>
-        <w:jc w:val="center"/>
+      <w:bookmarkStart w:id="5" w:name="_Toc223197333"/>
+      <w:r>
         <w:rPr>
           <w:rFonts w:ascii="Times New Roman" w:hAnsi="Times New Roman" w:cs="Times New Roman"/>
           <w:b/>
@@ -2485,16 +2896,7 @@
           <w:sz w:val="24"/>
           <w:szCs w:val="24"/>
         </w:rPr>
-      </w:pPr>
-      <w:r>
-        <w:rPr>
-          <w:rFonts w:ascii="Times New Roman" w:hAnsi="Times New Roman" w:cs="Times New Roman"/>
-          <w:b/>
-          <w:bCs/>
-          <w:color w:val="auto"/>
-          <w:sz w:val="24"/>
-          <w:szCs w:val="24"/>
-        </w:rPr>
+        <w:lastRenderedPageBreak/>
         <w:t>Gantt Chart:</w:t>
       </w:r>
       <w:bookmarkEnd w:id="5"/>
@@ -2576,7 +2978,7 @@
           <w:szCs w:val="24"/>
         </w:rPr>
       </w:pPr>
-      <w:bookmarkStart w:id="6" w:name="_Toc223085462"/>
+      <w:bookmarkStart w:id="6" w:name="_Toc223197334"/>
       <w:r>
         <w:rPr>
           <w:rFonts w:ascii="Times New Roman" w:hAnsi="Times New Roman" w:cs="Times New Roman"/>
@@ -2667,35 +3069,19 @@
         <w:rPr>
           <w:rFonts w:ascii="Times New Roman" w:hAnsi="Times New Roman" w:cs="Times New Roman"/>
         </w:rPr>
-        <w:t xml:space="preserve">We also want to continue to develop our maps page, as we began </w:t>
-      </w:r>
-      <w:proofErr w:type="gramStart"/>
-      <w:r>
-        <w:rPr>
-          <w:rFonts w:ascii="Times New Roman" w:hAnsi="Times New Roman" w:cs="Times New Roman"/>
-        </w:rPr>
-        <w:t>work</w:t>
-      </w:r>
-      <w:proofErr w:type="gramEnd"/>
-      <w:r>
-        <w:rPr>
-          <w:rFonts w:ascii="Times New Roman" w:hAnsi="Times New Roman" w:cs="Times New Roman"/>
-        </w:rPr>
-        <w:t xml:space="preserve"> on this page </w:t>
-      </w:r>
-      <w:proofErr w:type="gramStart"/>
-      <w:r>
-        <w:rPr>
-          <w:rFonts w:ascii="Times New Roman" w:hAnsi="Times New Roman" w:cs="Times New Roman"/>
-        </w:rPr>
-        <w:t>later on</w:t>
-      </w:r>
-      <w:proofErr w:type="gramEnd"/>
-      <w:r>
-        <w:rPr>
-          <w:rFonts w:ascii="Times New Roman" w:hAnsi="Times New Roman" w:cs="Times New Roman"/>
-        </w:rPr>
-        <w:t xml:space="preserve"> in week 7. </w:t>
+        <w:t>We also want to</w:t>
+      </w:r>
+      <w:r>
+        <w:rPr>
+          <w:rFonts w:ascii="Times New Roman" w:hAnsi="Times New Roman" w:cs="Times New Roman"/>
+        </w:rPr>
+        <w:t xml:space="preserve"> add </w:t>
+      </w:r>
+      <w:r>
+        <w:rPr>
+          <w:rFonts w:ascii="Times New Roman" w:hAnsi="Times New Roman" w:cs="Times New Roman"/>
+        </w:rPr>
+        <w:t>additional features to the Maps page, such as delete route.</w:t>
       </w:r>
     </w:p>
     <w:p>
@@ -2720,7 +3106,7 @@
         </w:rPr>
         <w:br w:type="page"/>
       </w:r>
-      <w:bookmarkStart w:id="7" w:name="_Toc223085463"/>
+      <w:bookmarkStart w:id="7" w:name="_Toc223197335"/>
       <w:r>
         <w:rPr>
           <w:rFonts w:ascii="Times New Roman" w:hAnsi="Times New Roman" w:cs="Times New Roman"/>
@@ -2878,6 +3264,18 @@
               </w:rPr>
               <w:t>, Maps page, User Authentication</w:t>
             </w:r>
+            <w:r>
+              <w:rPr>
+                <w:rFonts w:ascii="Times New Roman" w:hAnsi="Times New Roman" w:cs="Times New Roman"/>
+              </w:rPr>
+              <w:t>, Maps Page, Database/API logic</w:t>
+            </w:r>
+            <w:r>
+              <w:rPr>
+                <w:rFonts w:ascii="Times New Roman" w:hAnsi="Times New Roman" w:cs="Times New Roman"/>
+              </w:rPr>
+              <w:t>, research</w:t>
+            </w:r>
           </w:p>
           <w:p>
             <w:pPr>
@@ -2973,6 +3371,12 @@
                 <w:rFonts w:ascii="Times New Roman" w:hAnsi="Times New Roman" w:cs="Times New Roman"/>
               </w:rPr>
               <w:t>, Password recovery</w:t>
+            </w:r>
+            <w:r>
+              <w:rPr>
+                <w:rFonts w:ascii="Times New Roman" w:hAnsi="Times New Roman" w:cs="Times New Roman"/>
+              </w:rPr>
+              <w:t>, research</w:t>
             </w:r>
           </w:p>
         </w:tc>
@@ -3113,20 +3517,181 @@
     </w:p>
     <w:p>
       <w:pPr>
-        <w:rPr>
-          <w:rFonts w:ascii="Times New Roman" w:hAnsi="Times New Roman" w:cs="Times New Roman"/>
-        </w:rPr>
-      </w:pPr>
+        <w:pStyle w:val="Heading1"/>
+        <w:jc w:val="center"/>
+        <w:rPr>
+          <w:rFonts w:ascii="Times New Roman" w:hAnsi="Times New Roman" w:cs="Times New Roman"/>
+          <w:color w:val="auto"/>
+          <w:sz w:val="24"/>
+          <w:szCs w:val="24"/>
+          <w:u w:val="single"/>
+        </w:rPr>
+      </w:pPr>
+      <w:bookmarkStart w:id="8" w:name="_Toc223197336"/>
+      <w:r>
+        <w:rPr>
+          <w:rFonts w:ascii="Times New Roman" w:hAnsi="Times New Roman" w:cs="Times New Roman"/>
+          <w:color w:val="auto"/>
+          <w:sz w:val="24"/>
+          <w:szCs w:val="24"/>
+          <w:u w:val="single"/>
+        </w:rPr>
+        <w:t>Reference</w:t>
+      </w:r>
+      <w:r>
+        <w:rPr>
+          <w:rFonts w:ascii="Times New Roman" w:hAnsi="Times New Roman" w:cs="Times New Roman"/>
+          <w:color w:val="auto"/>
+          <w:sz w:val="24"/>
+          <w:szCs w:val="24"/>
+          <w:u w:val="single"/>
+        </w:rPr>
+        <w:t>s</w:t>
+      </w:r>
+      <w:bookmarkEnd w:id="8"/>
+    </w:p>
+    <w:p/>
+    <w:p>
+      <w:pPr>
+        <w:rPr>
+          <w:rFonts w:ascii="Times New Roman" w:hAnsi="Times New Roman" w:cs="Times New Roman"/>
+        </w:rPr>
+      </w:pPr>
+      <w:hyperlink r:id="rId12" w:history="1">
+        <w:r>
+          <w:rPr>
+            <w:rStyle w:val="Hyperlink"/>
+            <w:rFonts w:ascii="Times New Roman" w:hAnsi="Times New Roman" w:cs="Times New Roman"/>
+            <w:color w:val="auto"/>
+            <w:u w:val="none"/>
+          </w:rPr>
+          <w:t>Agafonkin</w:t>
+        </w:r>
+      </w:hyperlink>
+      <w:r>
+        <w:rPr>
+          <w:rFonts w:ascii="Times New Roman" w:hAnsi="Times New Roman" w:cs="Times New Roman"/>
+        </w:rPr>
+        <w:t>, V. (2025, Aug</w:t>
+      </w:r>
+      <w:r>
+        <w:rPr>
+          <w:rFonts w:ascii="Times New Roman" w:hAnsi="Times New Roman" w:cs="Times New Roman"/>
+        </w:rPr>
+        <w:t xml:space="preserve"> 16</w:t>
+      </w:r>
+      <w:r>
+        <w:rPr>
+          <w:rFonts w:ascii="Times New Roman" w:hAnsi="Times New Roman" w:cs="Times New Roman"/>
+          <w:vertAlign w:val="superscript"/>
+        </w:rPr>
+        <w:t>th</w:t>
+      </w:r>
+      <w:r>
+        <w:rPr>
+          <w:rFonts w:ascii="Times New Roman" w:hAnsi="Times New Roman" w:cs="Times New Roman"/>
+        </w:rPr>
+        <w:t>)</w:t>
+      </w:r>
+      <w:r>
+        <w:rPr>
+          <w:rFonts w:ascii="Times New Roman" w:hAnsi="Times New Roman" w:cs="Times New Roman"/>
+        </w:rPr>
+        <w:t>. Leaflet.</w:t>
+      </w:r>
     </w:p>
     <w:p>
       <w:pPr>
+        <w:ind w:firstLine="720"/>
+        <w:rPr>
+          <w:rFonts w:ascii="Times New Roman" w:hAnsi="Times New Roman" w:cs="Times New Roman"/>
+        </w:rPr>
+      </w:pPr>
+      <w:hyperlink r:id="rId13" w:history="1">
+        <w:r>
+          <w:rPr>
+            <w:rStyle w:val="Hyperlink"/>
+            <w:rFonts w:ascii="Times New Roman" w:hAnsi="Times New Roman" w:cs="Times New Roman"/>
+            <w:color w:val="0070C0"/>
+          </w:rPr>
+          <w:t>https://leafletjs.com/</w:t>
+        </w:r>
+      </w:hyperlink>
+    </w:p>
+    <w:p>
+      <w:pPr>
+        <w:rPr>
+          <w:rFonts w:ascii="Times New Roman" w:hAnsi="Times New Roman" w:cs="Times New Roman"/>
+        </w:rPr>
+      </w:pPr>
+      <w:r>
+        <w:rPr>
+          <w:rFonts w:ascii="Times New Roman" w:hAnsi="Times New Roman" w:cs="Times New Roman"/>
+        </w:rPr>
+        <w:t>Open</w:t>
+      </w:r>
+      <w:r>
+        <w:rPr>
+          <w:rFonts w:ascii="Times New Roman" w:hAnsi="Times New Roman" w:cs="Times New Roman"/>
+        </w:rPr>
+        <w:t>StreetMap. (2025)</w:t>
+      </w:r>
+      <w:r>
+        <w:rPr>
+          <w:rFonts w:ascii="Times New Roman" w:hAnsi="Times New Roman" w:cs="Times New Roman"/>
+        </w:rPr>
+        <w:t xml:space="preserve">. </w:t>
+      </w:r>
+      <w:r>
+        <w:rPr>
+          <w:rFonts w:ascii="Times New Roman" w:hAnsi="Times New Roman" w:cs="Times New Roman"/>
+        </w:rPr>
+        <w:t>OpenStreetMap</w:t>
+      </w:r>
+      <w:r>
+        <w:rPr>
+          <w:rFonts w:ascii="Times New Roman" w:hAnsi="Times New Roman" w:cs="Times New Roman"/>
+        </w:rPr>
+        <w:t>.</w:t>
+      </w:r>
+    </w:p>
+    <w:p>
+      <w:pPr>
+        <w:ind w:firstLine="720"/>
+        <w:rPr>
+          <w:rFonts w:ascii="Times New Roman" w:hAnsi="Times New Roman" w:cs="Times New Roman"/>
+          <w:color w:val="0070C0"/>
+        </w:rPr>
+      </w:pPr>
+      <w:hyperlink r:id="rId14" w:history="1">
+        <w:r>
+          <w:rPr>
+            <w:rStyle w:val="Hyperlink"/>
+            <w:rFonts w:ascii="Times New Roman" w:hAnsi="Times New Roman" w:cs="Times New Roman"/>
+            <w:color w:val="0070C0"/>
+          </w:rPr>
+          <w:t>https://www.openstreetmap.org/copyright</w:t>
+        </w:r>
+      </w:hyperlink>
+    </w:p>
+    <w:p>
+      <w:pPr>
+        <w:rPr>
+          <w:rFonts w:ascii="Times New Roman" w:hAnsi="Times New Roman" w:cs="Times New Roman"/>
+        </w:rPr>
+      </w:pPr>
+    </w:p>
+    <w:p/>
+    <w:p/>
+    <w:p>
+      <w:pPr>
         <w:rPr>
           <w:rFonts w:ascii="Times New Roman" w:hAnsi="Times New Roman" w:cs="Times New Roman"/>
         </w:rPr>
       </w:pPr>
     </w:p>
     <w:sectPr>
-      <w:footerReference w:type="default" r:id="rId12"/>
+      <w:footerReference w:type="default" r:id="rId15"/>
       <w:pgSz w:w="12240" w:h="15840"/>
       <w:pgMar w:top="1440" w:right="1440" w:bottom="1440" w:left="1440" w:header="720" w:footer="720" w:gutter="0"/>
       <w:pgBorders w:display="firstPage" w:offsetFrom="page">
@@ -5122,7 +5687,6 @@
   <w:style w:type="character" w:default="1" w:styleId="DefaultParagraphFont">
     <w:name w:val="Default Paragraph Font"/>
     <w:uiPriority w:val="1"/>
-    <w:semiHidden/>
     <w:unhideWhenUsed/>
   </w:style>
   <w:style w:type="table" w:default="1" w:styleId="TableNormal">
@@ -5690,6 +6254,30 @@
       </w:tcPr>
     </w:tblStylePr>
   </w:style>
+  <w:style w:type="character" w:styleId="UnresolvedMention">
+    <w:name w:val="Unresolved Mention"/>
+    <w:basedOn w:val="DefaultParagraphFont"/>
+    <w:uiPriority w:val="99"/>
+    <w:semiHidden/>
+    <w:unhideWhenUsed/>
+    <w:rsid w:val="00645CD1"/>
+    <w:rPr>
+      <w:color w:val="605E5C"/>
+      <w:shd w:val="clear" w:color="auto" w:fill="E1DFDD"/>
+    </w:rPr>
+  </w:style>
+  <w:style w:type="character" w:styleId="FollowedHyperlink">
+    <w:name w:val="FollowedHyperlink"/>
+    <w:basedOn w:val="DefaultParagraphFont"/>
+    <w:uiPriority w:val="99"/>
+    <w:semiHidden/>
+    <w:unhideWhenUsed/>
+    <w:rsid w:val="00B438C4"/>
+    <w:rPr>
+      <w:color w:val="96A9A9" w:themeColor="followedHyperlink"/>
+      <w:u w:val="single"/>
+    </w:rPr>
+  </w:style>
 </w:styles>
 </file>
 

</xml_diff>

<commit_message>
prepare for submit small change to slides
</commit_message>
<xml_diff>
--- a/Documentation/Weekly Report/week7/CMSC-4920-Week7Report-Group2.docx
+++ b/Documentation/Weekly Report/week7/CMSC-4920-Week7Report-Group2.docx
@@ -1625,21 +1625,7 @@
         <w:rPr>
           <w:rFonts w:ascii="Times New Roman" w:hAnsi="Times New Roman" w:cs="Times New Roman"/>
         </w:rPr>
-        <w:t xml:space="preserve">implementing a feature that ensures a user is logged in before they can access the dashboard, </w:t>
-      </w:r>
-      <w:proofErr w:type="gramStart"/>
-      <w:r>
-        <w:rPr>
-          <w:rFonts w:ascii="Times New Roman" w:hAnsi="Times New Roman" w:cs="Times New Roman"/>
-        </w:rPr>
-        <w:t>opening up</w:t>
-      </w:r>
-      <w:proofErr w:type="gramEnd"/>
-      <w:r>
-        <w:rPr>
-          <w:rFonts w:ascii="Times New Roman" w:hAnsi="Times New Roman" w:cs="Times New Roman"/>
-        </w:rPr>
-        <w:t xml:space="preserve"> our program</w:t>
+        <w:t>implementing a feature that ensures a user is logged in before they can access the dashboard, opening up our program</w:t>
       </w:r>
       <w:r>
         <w:rPr>
@@ -1669,21 +1655,7 @@
         <w:rPr>
           <w:rFonts w:ascii="Times New Roman" w:hAnsi="Times New Roman" w:cs="Times New Roman"/>
         </w:rPr>
-        <w:t xml:space="preserve"> </w:t>
-      </w:r>
-      <w:proofErr w:type="gramStart"/>
-      <w:r>
-        <w:rPr>
-          <w:rFonts w:ascii="Times New Roman" w:hAnsi="Times New Roman" w:cs="Times New Roman"/>
-        </w:rPr>
-        <w:t>work</w:t>
-      </w:r>
-      <w:proofErr w:type="gramEnd"/>
-      <w:r>
-        <w:rPr>
-          <w:rFonts w:ascii="Times New Roman" w:hAnsi="Times New Roman" w:cs="Times New Roman"/>
-        </w:rPr>
-        <w:t xml:space="preserve"> on a recovery email feature</w:t>
+        <w:t xml:space="preserve"> work on a recovery email feature</w:t>
       </w:r>
       <w:r>
         <w:rPr>
@@ -1707,21 +1679,7 @@
         <w:rPr>
           <w:rFonts w:ascii="Times New Roman" w:hAnsi="Times New Roman" w:cs="Times New Roman"/>
         </w:rPr>
-        <w:t xml:space="preserve"> development of both the challenges and </w:t>
-      </w:r>
-      <w:proofErr w:type="gramStart"/>
-      <w:r>
-        <w:rPr>
-          <w:rFonts w:ascii="Times New Roman" w:hAnsi="Times New Roman" w:cs="Times New Roman"/>
-        </w:rPr>
-        <w:t>teams</w:t>
-      </w:r>
-      <w:proofErr w:type="gramEnd"/>
-      <w:r>
-        <w:rPr>
-          <w:rFonts w:ascii="Times New Roman" w:hAnsi="Times New Roman" w:cs="Times New Roman"/>
-        </w:rPr>
-        <w:t xml:space="preserve"> page</w:t>
+        <w:t xml:space="preserve"> development of both the challenges and teams page</w:t>
       </w:r>
       <w:r>
         <w:rPr>
@@ -1891,21 +1849,7 @@
         <w:rPr>
           <w:rFonts w:ascii="Times New Roman" w:hAnsi="Times New Roman" w:cs="Times New Roman"/>
         </w:rPr>
-        <w:t xml:space="preserve">Feedback was placed into the user feedback document. Users brought up changes we know we </w:t>
-      </w:r>
-      <w:proofErr w:type="gramStart"/>
-      <w:r>
-        <w:rPr>
-          <w:rFonts w:ascii="Times New Roman" w:hAnsi="Times New Roman" w:cs="Times New Roman"/>
-        </w:rPr>
-        <w:t>have to</w:t>
-      </w:r>
-      <w:proofErr w:type="gramEnd"/>
-      <w:r>
-        <w:rPr>
-          <w:rFonts w:ascii="Times New Roman" w:hAnsi="Times New Roman" w:cs="Times New Roman"/>
-        </w:rPr>
-        <w:t xml:space="preserve"> make and changes that we had no idea needed fixing. One of the main ones was to </w:t>
+        <w:t xml:space="preserve">Feedback was placed into the user feedback document. Users brought up changes we know we have to make and changes that we had no idea needed fixing. One of the main ones was to </w:t>
       </w:r>
       <w:r>
         <w:rPr>
@@ -2834,14 +2778,12 @@
         </w:rPr>
         <w:t xml:space="preserve">The last accomplishment of this week was the continued development of both our challenges and teams pages. The development of both is moving at a slow but steady pace as we are trying to link the activity data and the frontend to present </w:t>
       </w:r>
-      <w:proofErr w:type="gramStart"/>
-      <w:r>
-        <w:rPr>
-          <w:rFonts w:ascii="Times New Roman" w:hAnsi="Times New Roman" w:cs="Times New Roman"/>
-        </w:rPr>
-        <w:t>user</w:t>
-      </w:r>
-      <w:proofErr w:type="gramEnd"/>
+      <w:r>
+        <w:rPr>
+          <w:rFonts w:ascii="Times New Roman" w:hAnsi="Times New Roman" w:cs="Times New Roman"/>
+        </w:rPr>
+        <w:t>users</w:t>
+      </w:r>
       <w:r>
         <w:rPr>
           <w:rFonts w:ascii="Times New Roman" w:hAnsi="Times New Roman" w:cs="Times New Roman"/>
@@ -3646,13 +3588,7 @@
         <w:rPr>
           <w:rFonts w:ascii="Times New Roman" w:hAnsi="Times New Roman" w:cs="Times New Roman"/>
         </w:rPr>
-        <w:t>OpenStreetMap</w:t>
-      </w:r>
-      <w:r>
-        <w:rPr>
-          <w:rFonts w:ascii="Times New Roman" w:hAnsi="Times New Roman" w:cs="Times New Roman"/>
-        </w:rPr>
-        <w:t>.</w:t>
+        <w:t>OpenStreetMap.</w:t>
       </w:r>
     </w:p>
     <w:p>
@@ -5687,6 +5623,7 @@
   <w:style w:type="character" w:default="1" w:styleId="DefaultParagraphFont">
     <w:name w:val="Default Paragraph Font"/>
     <w:uiPriority w:val="1"/>
+    <w:semiHidden/>
     <w:unhideWhenUsed/>
   </w:style>
   <w:style w:type="table" w:default="1" w:styleId="TableNormal">

</xml_diff>